<commit_message>
feat: finalizando analisador sintático
</commit_message>
<xml_diff>
--- a/GramaticaEBNF.docx
+++ b/GramaticaEBNF.docx
@@ -244,7 +244,27 @@
           <w:szCs w:val="21"/>
           <w:lang w:val="pt-BR"/>
         </w:rPr>
-        <w:t xml:space="preserve"> “int” “main” BLOCO</w:t>
+        <w:t xml:space="preserve"> “int” “main” </w:t>
+      </w:r>
+      <w:r>
+        <w:rPr>
+          <w:rFonts w:hint="default" w:ascii="Arial" w:hAnsi="Arial" w:cs="Arial"/>
+          <w:sz w:val="21"/>
+          <w:szCs w:val="21"/>
+          <w:lang w:val="pt-BR"/>
+        </w:rPr>
+        <w:t xml:space="preserve">"("  ")" </w:t>
+      </w:r>
+      <w:bookmarkStart w:id="0" w:name="_GoBack"/>
+      <w:bookmarkEnd w:id="0"/>
+      <w:r>
+        <w:rPr>
+          <w:rFonts w:ascii="Arial" w:hAnsi="Arial" w:cs="Arial"/>
+          <w:sz w:val="21"/>
+          <w:szCs w:val="21"/>
+          <w:lang w:val="pt-BR"/>
+        </w:rPr>
+        <w:t>BLOCO</w:t>
       </w:r>
     </w:p>
     <w:p>
@@ -816,18 +836,7 @@
           <w:szCs w:val="21"/>
           <w:lang w:val="pt-BR"/>
         </w:rPr>
-        <w:t xml:space="preserve"> "whi</w:t>
-      </w:r>
-      <w:bookmarkStart w:id="0" w:name="_GoBack"/>
-      <w:bookmarkEnd w:id="0"/>
-      <w:r>
-        <w:rPr>
-          <w:rFonts w:ascii="Arial" w:hAnsi="Arial" w:cs="Arial"/>
-          <w:sz w:val="21"/>
-          <w:szCs w:val="21"/>
-          <w:lang w:val="pt-BR"/>
-        </w:rPr>
-        <w:t>le" "(" EXPRESSAOLOGICA ")" COMANDO</w:t>
+        <w:t xml:space="preserve"> "while" "(" EXPRESSAOLOGICA ")" COMANDO</w:t>
       </w:r>
     </w:p>
     <w:p>
@@ -2507,7 +2516,24 @@
           <w:sz w:val="21"/>
           <w:szCs w:val="21"/>
         </w:rPr>
-        <w:t xml:space="preserve"> = { $, "}", "else", "void", "char", "short", "int", "long", "float", "double", "a", ..., "z", "A", ..., "Z", "if", "while", "{" } </w:t>
+        <w:t xml:space="preserve"> = { $, "}", "else", "void", "char", "int",</w:t>
+      </w:r>
+      <w:r>
+        <w:rPr>
+          <w:rFonts w:hint="default" w:ascii="Arial" w:hAnsi="Arial"/>
+          <w:sz w:val="21"/>
+          <w:szCs w:val="21"/>
+          <w:lang w:val="pt-BR"/>
+        </w:rPr>
+        <w:t xml:space="preserve"> </w:t>
+      </w:r>
+      <w:r>
+        <w:rPr>
+          <w:rFonts w:ascii="Arial" w:hAnsi="Arial"/>
+          <w:sz w:val="21"/>
+          <w:szCs w:val="21"/>
+        </w:rPr>
+        <w:t xml:space="preserve">"float", "double", "a", ..., "z", "A", ..., "Z", "if", "while", "{" } </w:t>
       </w:r>
     </w:p>
     <w:p>
@@ -2534,7 +2560,7 @@
           <w:sz w:val="21"/>
           <w:szCs w:val="21"/>
         </w:rPr>
-        <w:t xml:space="preserve"> = { $, "}", "else", "void", "char", "short", "int", "long", "float", "double", "a", ..., "z", "A", ..., "Z", "if", "while", "{" }</w:t>
+        <w:t xml:space="preserve"> = { $, "}", "else", "void", "char", "int", "float", "double", "a", ..., "z", "A", ..., "Z", "if", "while", "{" }</w:t>
       </w:r>
     </w:p>
     <w:p>
@@ -2593,7 +2619,7 @@
           <w:sz w:val="21"/>
           <w:szCs w:val="21"/>
         </w:rPr>
-        <w:t xml:space="preserve"> = { $, "}", "else", "void", "char", "short", "int", "long", "float", "double", "a", ..., "z", "A", ..., "Z", "if", "while", "{" } </w:t>
+        <w:t xml:space="preserve"> = { $, "}", "else", "void", "char", "int", "float", "double", "a", ..., "z", "A", ..., "Z", "if", "while", "{" } </w:t>
       </w:r>
     </w:p>
     <w:p>
@@ -2620,7 +2646,24 @@
           <w:sz w:val="21"/>
           <w:szCs w:val="21"/>
         </w:rPr>
-        <w:t xml:space="preserve">= { $, "}", "else", "void", "char", "short", "int", "long", "float", "double", "a", ..., "z", "A", ...,"Z", "if", "while", "{" } </w:t>
+        <w:t>= { $, "}", "else", "void", "char", "int",</w:t>
+      </w:r>
+      <w:r>
+        <w:rPr>
+          <w:rFonts w:hint="default" w:ascii="Arial" w:hAnsi="Arial"/>
+          <w:sz w:val="21"/>
+          <w:szCs w:val="21"/>
+          <w:lang w:val="pt-BR"/>
+        </w:rPr>
+        <w:t xml:space="preserve"> </w:t>
+      </w:r>
+      <w:r>
+        <w:rPr>
+          <w:rFonts w:ascii="Arial" w:hAnsi="Arial"/>
+          <w:sz w:val="21"/>
+          <w:szCs w:val="21"/>
+        </w:rPr>
+        <w:t xml:space="preserve">"float", "double", "a", ..., "z", "A", ...,"Z", "if", "while", "{" } </w:t>
       </w:r>
     </w:p>
     <w:p>
@@ -2647,7 +2690,7 @@
           <w:sz w:val="21"/>
           <w:szCs w:val="21"/>
         </w:rPr>
-        <w:t xml:space="preserve">= { $, "}", "else", "void", "char", "short", "int", "long", "float", "double", "a", ..., "z", "A", ..., "Z", "if", "while", "{" } </w:t>
+        <w:t xml:space="preserve">= { $, "}", "else", "void", "char", "int", "double", "a", ..., "z", "A", ..., "Z", "if", "while", "{" } </w:t>
       </w:r>
     </w:p>
     <w:p>
@@ -2674,7 +2717,7 @@
           <w:sz w:val="21"/>
           <w:szCs w:val="21"/>
         </w:rPr>
-        <w:t xml:space="preserve">= { $, "}", "else", "void", "char", "short", "int", "long", "float", "double", "a", ..., "z", "A", ..., "Z", "if", "while", "{" } </w:t>
+        <w:t xml:space="preserve">= { $, "}", "else", "void", "char", "int", "float", "double", "a", ..., "z", "A", ..., "Z", "if", "while", "{" } </w:t>
       </w:r>
     </w:p>
     <w:p>
@@ -3137,7 +3180,7 @@
     <w:lsdException w:qFormat="1" w:unhideWhenUsed="0" w:uiPriority="0" w:semiHidden="0" w:name="Title"/>
     <w:lsdException w:unhideWhenUsed="0" w:uiPriority="0" w:semiHidden="0" w:name="Closing"/>
     <w:lsdException w:unhideWhenUsed="0" w:uiPriority="0" w:semiHidden="0" w:name="Signature"/>
-    <w:lsdException w:uiPriority="1" w:name="Default Paragraph Font"/>
+    <w:lsdException w:qFormat="1" w:uiPriority="1" w:name="Default Paragraph Font"/>
     <w:lsdException w:unhideWhenUsed="0" w:uiPriority="0" w:semiHidden="0" w:name="Body Text"/>
     <w:lsdException w:unhideWhenUsed="0" w:uiPriority="0" w:semiHidden="0" w:name="Body Text Indent"/>
     <w:lsdException w:unhideWhenUsed="0" w:uiPriority="0" w:semiHidden="0" w:name="List Continue"/>
@@ -3236,6 +3279,7 @@
     <w:name w:val="Default Paragraph Font"/>
     <w:semiHidden/>
     <w:unhideWhenUsed/>
+    <w:qFormat/>
     <w:uiPriority w:val="1"/>
   </w:style>
   <w:style w:type="table" w:default="1" w:styleId="3">

</xml_diff>

<commit_message>
fix: arrumando um pouco a GramaticaEBNF.docx
</commit_message>
<xml_diff>
--- a/GramaticaEBNF.docx
+++ b/GramaticaEBNF.docx
@@ -1,6 +1,6 @@
 
 <file path=word/document.xml><?xml version="1.0" encoding="utf-8"?>
-<w:document xmlns:wpc="http://schemas.microsoft.com/office/word/2010/wordprocessingCanvas" xmlns:mc="http://schemas.openxmlformats.org/markup-compatibility/2006" xmlns:o="urn:schemas-microsoft-com:office:office" xmlns:r="http://schemas.openxmlformats.org/officeDocument/2006/relationships" xmlns:m="http://schemas.openxmlformats.org/officeDocument/2006/math" xmlns:v="urn:schemas-microsoft-com:vml" xmlns:wp14="http://schemas.microsoft.com/office/word/2010/wordprocessingDrawing" xmlns:wp="http://schemas.openxmlformats.org/drawingml/2006/wordprocessingDrawing" xmlns:w="http://schemas.openxmlformats.org/wordprocessingml/2006/main" xmlns:w14="http://schemas.microsoft.com/office/word/2010/wordml" xmlns:w10="urn:schemas-microsoft-com:office:word" xmlns:w15="http://schemas.microsoft.com/office/word/2012/wordml" xmlns:wpg="http://schemas.microsoft.com/office/word/2010/wordprocessingGroup" xmlns:wpi="http://schemas.microsoft.com/office/word/2010/wordprocessingInk" xmlns:wne="http://schemas.microsoft.com/office/word/2006/wordml" xmlns:wps="http://schemas.microsoft.com/office/word/2010/wordprocessingShape" xmlns:wpsCustomData="http://www.wps.cn/officeDocument/2013/wpsCustomData" mc:Ignorable="w14 w15 wp14">
+<w:document xmlns:wpc="http://schemas.microsoft.com/office/word/2010/wordprocessingCanvas" xmlns:cx="http://schemas.microsoft.com/office/drawing/2014/chartex" xmlns:cx1="http://schemas.microsoft.com/office/drawing/2015/9/8/chartex" xmlns:cx2="http://schemas.microsoft.com/office/drawing/2015/10/21/chartex" xmlns:cx3="http://schemas.microsoft.com/office/drawing/2016/5/9/chartex" xmlns:cx4="http://schemas.microsoft.com/office/drawing/2016/5/10/chartex" xmlns:cx5="http://schemas.microsoft.com/office/drawing/2016/5/11/chartex" xmlns:cx6="http://schemas.microsoft.com/office/drawing/2016/5/12/chartex" xmlns:cx7="http://schemas.microsoft.com/office/drawing/2016/5/13/chartex" xmlns:cx8="http://schemas.microsoft.com/office/drawing/2016/5/14/chartex" xmlns:mc="http://schemas.openxmlformats.org/markup-compatibility/2006" xmlns:aink="http://schemas.microsoft.com/office/drawing/2016/ink" xmlns:am3d="http://schemas.microsoft.com/office/drawing/2017/model3d" xmlns:o="urn:schemas-microsoft-com:office:office" xmlns:oel="http://schemas.microsoft.com/office/2019/extlst" xmlns:r="http://schemas.openxmlformats.org/officeDocument/2006/relationships" xmlns:m="http://schemas.openxmlformats.org/officeDocument/2006/math" xmlns:v="urn:schemas-microsoft-com:vml" xmlns:wp14="http://schemas.microsoft.com/office/word/2010/wordprocessingDrawing" xmlns:wp="http://schemas.openxmlformats.org/drawingml/2006/wordprocessingDrawing" xmlns:w10="urn:schemas-microsoft-com:office:word" xmlns:w="http://schemas.openxmlformats.org/wordprocessingml/2006/main" xmlns:w14="http://schemas.microsoft.com/office/word/2010/wordml" xmlns:w15="http://schemas.microsoft.com/office/word/2012/wordml" xmlns:w16cex="http://schemas.microsoft.com/office/word/2018/wordml/cex" xmlns:w16cid="http://schemas.microsoft.com/office/word/2016/wordml/cid" xmlns:w16="http://schemas.microsoft.com/office/word/2018/wordml" xmlns:w16du="http://schemas.microsoft.com/office/word/2023/wordml/word16du" xmlns:w16sdtdh="http://schemas.microsoft.com/office/word/2020/wordml/sdtdatahash" xmlns:w16sdtfl="http://schemas.microsoft.com/office/word/2024/wordml/sdtformatlock" xmlns:w16se="http://schemas.microsoft.com/office/word/2015/wordml/symex" xmlns:wpg="http://schemas.microsoft.com/office/word/2010/wordprocessingGroup" xmlns:wpi="http://schemas.microsoft.com/office/word/2010/wordprocessingInk" xmlns:wne="http://schemas.microsoft.com/office/word/2006/wordml" xmlns:wps="http://schemas.microsoft.com/office/word/2010/wordprocessingShape" mc:Ignorable="w14 w15 w16se w16cid w16 w16cex w16sdtdh w16sdtfl w16du wp14">
   <w:body>
     <w:p>
       <w:pPr>
@@ -405,15 +405,7 @@
       <w:r>
         <w:rPr>
           <w:rFonts w:ascii="Arial" w:hAnsi="Arial" w:cs="Arial"/>
-          <w:sz w:val="21"/>
-          <w:szCs w:val="21"/>
-          <w:lang w:val="pt-BR"/>
-        </w:rPr>
-        <w:t xml:space="preserve"> "void" | "char” [ “[”</w:t>
-      </w:r>
-      <w:r>
-        <w:rPr>
-          <w:rFonts w:hint="default" w:ascii="Arial" w:hAnsi="Arial" w:cs="Arial"/>
+          <w:b/>
           <w:sz w:val="21"/>
           <w:szCs w:val="21"/>
           <w:lang w:val="pt-BR"/>
@@ -422,7 +414,16 @@
       </w:r>
       <w:r>
         <w:rPr>
-          <w:rFonts w:ascii="Arial" w:hAnsi="Arial" w:eastAsia="sans-serif" w:cs="Arial"/>
+          <w:rFonts w:ascii="Arial" w:hAnsi="Arial" w:cs="Arial"/>
+          <w:sz w:val="21"/>
+          <w:szCs w:val="21"/>
+          <w:lang w:val="pt-BR"/>
+        </w:rPr>
+        <w:t xml:space="preserve">"void" | "char” [ “[” </w:t>
+      </w:r>
+      <w:r>
+        <w:rPr>
+          <w:rFonts w:ascii="Arial" w:eastAsia="sans-serif" w:hAnsi="Arial" w:cs="Arial"/>
           <w:color w:val="3F3F3F"/>
           <w:sz w:val="21"/>
           <w:szCs w:val="21"/>
@@ -431,20 +432,601 @@
         </w:rPr>
         <w:t xml:space="preserve"> </w:t>
       </w:r>
-      <w:bookmarkStart w:id="0" w:name="_GoBack"/>
-      <w:bookmarkEnd w:id="0"/>
-      <w:r>
-        <w:rPr>
-          <w:rFonts w:ascii="Arial" w:hAnsi="Arial" w:cs="Arial"/>
-          <w:sz w:val="21"/>
-          <w:szCs w:val="21"/>
-          <w:lang w:val="pt-BR"/>
-        </w:rPr>
-        <w:t>“]" ] | "int" | "float" |</w:t>
-      </w:r>
-      <w:r>
-        <w:rPr>
-          <w:rFonts w:hint="default" w:ascii="Arial" w:hAnsi="Arial" w:cs="Arial"/>
+      <w:r>
+        <w:rPr>
+          <w:rFonts w:ascii="Arial" w:hAnsi="Arial" w:cs="Arial"/>
+          <w:sz w:val="21"/>
+          <w:szCs w:val="21"/>
+          <w:lang w:val="pt-BR"/>
+        </w:rPr>
+        <w:t>“]" ] | "int" | "float" | "double"</w:t>
+      </w:r>
+    </w:p>
+    <w:p>
+      <w:pPr>
+        <w:rPr>
+          <w:rFonts w:ascii="Arial" w:eastAsia="sans-serif" w:hAnsi="Arial" w:cs="Arial"/>
+          <w:color w:val="3F3F3F"/>
+          <w:sz w:val="21"/>
+          <w:szCs w:val="21"/>
+          <w:shd w:val="clear" w:color="auto" w:fill="FFFFFF"/>
+          <w:lang w:val="pt-BR"/>
+        </w:rPr>
+      </w:pPr>
+      <w:r>
+        <w:rPr>
+          <w:rFonts w:ascii="Arial" w:eastAsia="sans-serif" w:hAnsi="Arial" w:cs="Arial"/>
+          <w:b/>
+          <w:bCs/>
+          <w:color w:val="3F3F3F"/>
+          <w:sz w:val="21"/>
+          <w:szCs w:val="21"/>
+          <w:shd w:val="clear" w:color="auto" w:fill="FFFFFF"/>
+          <w:lang w:val="pt-BR"/>
+        </w:rPr>
+        <w:t xml:space="preserve">DECLARACAOVARIAVEL </w:t>
+      </w:r>
+      <w:r>
+        <w:rPr>
+          <w:rFonts w:ascii="Arial" w:eastAsia="sans-serif" w:hAnsi="Arial" w:cs="Arial"/>
+          <w:b/>
+          <w:color w:val="3F3F3F"/>
+          <w:sz w:val="21"/>
+          <w:szCs w:val="21"/>
+          <w:shd w:val="clear" w:color="auto" w:fill="FFFFFF"/>
+          <w:lang w:val="pt-BR"/>
+        </w:rPr>
+        <w:t>=&gt;</w:t>
+      </w:r>
+      <w:r>
+        <w:rPr>
+          <w:rFonts w:ascii="Arial" w:eastAsia="sans-serif" w:hAnsi="Arial" w:cs="Arial"/>
+          <w:color w:val="3F3F3F"/>
+          <w:sz w:val="21"/>
+          <w:szCs w:val="21"/>
+          <w:shd w:val="clear" w:color="auto" w:fill="FFFFFF"/>
+          <w:lang w:val="pt-BR"/>
+        </w:rPr>
+        <w:t xml:space="preserve"> TIPOVARIAVEL IDENTIFICADOR [ "=" EXPRESSAOLOGICA ] { "," IDENTIFICADOR [ "=" EXPRESSAOLOGICA ]} ";"</w:t>
+      </w:r>
+    </w:p>
+    <w:p>
+      <w:pPr>
+        <w:rPr>
+          <w:rFonts w:ascii="Arial" w:eastAsia="sans-serif" w:hAnsi="Arial" w:cs="Arial"/>
+          <w:color w:val="3F3F3F"/>
+          <w:sz w:val="21"/>
+          <w:szCs w:val="21"/>
+          <w:shd w:val="clear" w:color="auto" w:fill="FFFFFF"/>
+          <w:lang w:val="pt-BR"/>
+        </w:rPr>
+      </w:pPr>
+    </w:p>
+    <w:p>
+      <w:pPr>
+        <w:rPr>
+          <w:rFonts w:ascii="Arial" w:hAnsi="Arial" w:cs="Arial"/>
+          <w:b/>
+          <w:bCs/>
+          <w:sz w:val="21"/>
+          <w:szCs w:val="21"/>
+          <w:lang w:val="pt-BR"/>
+        </w:rPr>
+      </w:pPr>
+      <w:r>
+        <w:rPr>
+          <w:rFonts w:ascii="Arial" w:hAnsi="Arial" w:cs="Arial"/>
+          <w:b/>
+          <w:bCs/>
+          <w:sz w:val="21"/>
+          <w:szCs w:val="21"/>
+          <w:lang w:val="pt-BR"/>
+        </w:rPr>
+        <w:t>--- Atribuição</w:t>
+      </w:r>
+    </w:p>
+    <w:p>
+      <w:pPr>
+        <w:rPr>
+          <w:rFonts w:ascii="Arial" w:hAnsi="Arial" w:cs="Arial"/>
+          <w:sz w:val="21"/>
+          <w:szCs w:val="21"/>
+          <w:lang w:val="pt-BR"/>
+        </w:rPr>
+      </w:pPr>
+    </w:p>
+    <w:p>
+      <w:pPr>
+        <w:rPr>
+          <w:rFonts w:ascii="Arial" w:hAnsi="Arial" w:cs="Arial"/>
+          <w:sz w:val="21"/>
+          <w:szCs w:val="21"/>
+          <w:lang w:val="pt-BR"/>
+        </w:rPr>
+      </w:pPr>
+      <w:r>
+        <w:rPr>
+          <w:rFonts w:ascii="Arial" w:hAnsi="Arial" w:cs="Arial"/>
+          <w:b/>
+          <w:bCs/>
+          <w:sz w:val="21"/>
+          <w:szCs w:val="21"/>
+          <w:lang w:val="pt-BR"/>
+        </w:rPr>
+        <w:t xml:space="preserve">DECLARACAOATRIBUICAO </w:t>
+      </w:r>
+      <w:r>
+        <w:rPr>
+          <w:rFonts w:ascii="Arial" w:hAnsi="Arial" w:cs="Arial"/>
+          <w:b/>
+          <w:sz w:val="21"/>
+          <w:szCs w:val="21"/>
+          <w:lang w:val="pt-BR"/>
+        </w:rPr>
+        <w:t>=&gt;</w:t>
+      </w:r>
+      <w:r>
+        <w:rPr>
+          <w:rFonts w:ascii="Arial" w:hAnsi="Arial" w:cs="Arial"/>
+          <w:sz w:val="21"/>
+          <w:szCs w:val="21"/>
+          <w:lang w:val="pt-BR"/>
+        </w:rPr>
+        <w:t xml:space="preserve"> IDENTIFICADOR "=" EXPRESSAOLOGICA ";" </w:t>
+      </w:r>
+    </w:p>
+    <w:p>
+      <w:pPr>
+        <w:rPr>
+          <w:rFonts w:ascii="Arial" w:hAnsi="Arial" w:cs="Arial"/>
+          <w:sz w:val="21"/>
+          <w:szCs w:val="21"/>
+          <w:lang w:val="pt-BR"/>
+        </w:rPr>
+      </w:pPr>
+    </w:p>
+    <w:p>
+      <w:pPr>
+        <w:rPr>
+          <w:rFonts w:ascii="Arial" w:hAnsi="Arial" w:cs="Arial"/>
+          <w:sz w:val="21"/>
+          <w:szCs w:val="21"/>
+          <w:lang w:val="pt-BR"/>
+        </w:rPr>
+      </w:pPr>
+      <w:r>
+        <w:rPr>
+          <w:rFonts w:ascii="Arial" w:hAnsi="Arial" w:cs="Arial"/>
+          <w:b/>
+          <w:sz w:val="21"/>
+          <w:szCs w:val="21"/>
+          <w:lang w:val="pt-BR"/>
+        </w:rPr>
+        <w:t>DECLARACAORETORNO =&gt;</w:t>
+      </w:r>
+      <w:r>
+        <w:rPr>
+          <w:rFonts w:ascii="Arial" w:hAnsi="Arial" w:cs="Arial"/>
+          <w:sz w:val="21"/>
+          <w:szCs w:val="21"/>
+          <w:lang w:val="pt-BR"/>
+        </w:rPr>
+        <w:t xml:space="preserve"> “return” EXPRESSAOLOGICA “;”</w:t>
+      </w:r>
+    </w:p>
+    <w:p>
+      <w:pPr>
+        <w:rPr>
+          <w:rFonts w:ascii="Arial" w:hAnsi="Arial" w:cs="Arial"/>
+          <w:sz w:val="21"/>
+          <w:szCs w:val="21"/>
+          <w:lang w:val="pt-BR"/>
+        </w:rPr>
+      </w:pPr>
+    </w:p>
+    <w:p>
+      <w:pPr>
+        <w:rPr>
+          <w:rFonts w:ascii="Arial" w:hAnsi="Arial" w:cs="Arial"/>
+          <w:b/>
+          <w:bCs/>
+          <w:sz w:val="21"/>
+          <w:szCs w:val="21"/>
+          <w:lang w:val="pt-BR"/>
+        </w:rPr>
+      </w:pPr>
+      <w:r>
+        <w:rPr>
+          <w:rFonts w:ascii="Arial" w:hAnsi="Arial" w:cs="Arial"/>
+          <w:b/>
+          <w:bCs/>
+          <w:sz w:val="21"/>
+          <w:szCs w:val="21"/>
+          <w:lang w:val="pt-BR"/>
+        </w:rPr>
+        <w:t>--- Estruturas de Controle</w:t>
+      </w:r>
+    </w:p>
+    <w:p>
+      <w:pPr>
+        <w:rPr>
+          <w:rFonts w:ascii="Arial" w:hAnsi="Arial" w:cs="Arial"/>
+          <w:sz w:val="21"/>
+          <w:szCs w:val="21"/>
+          <w:lang w:val="pt-BR"/>
+        </w:rPr>
+      </w:pPr>
+    </w:p>
+    <w:p>
+      <w:pPr>
+        <w:rPr>
+          <w:rFonts w:ascii="Arial" w:hAnsi="Arial" w:cs="Arial"/>
+          <w:sz w:val="21"/>
+          <w:szCs w:val="21"/>
+          <w:lang w:val="pt-BR"/>
+        </w:rPr>
+      </w:pPr>
+      <w:r>
+        <w:rPr>
+          <w:rFonts w:ascii="Arial" w:hAnsi="Arial" w:cs="Arial"/>
+          <w:sz w:val="21"/>
+          <w:szCs w:val="21"/>
+          <w:lang w:val="pt-BR"/>
+        </w:rPr>
+        <w:tab/>
+      </w:r>
+      <w:r>
+        <w:rPr>
+          <w:rFonts w:ascii="Arial" w:hAnsi="Arial" w:cs="Arial"/>
+          <w:b/>
+          <w:bCs/>
+          <w:sz w:val="21"/>
+          <w:szCs w:val="21"/>
+          <w:lang w:val="pt-BR"/>
+        </w:rPr>
+        <w:t>--- Condicional</w:t>
+      </w:r>
+    </w:p>
+    <w:p>
+      <w:pPr>
+        <w:rPr>
+          <w:rFonts w:ascii="Arial" w:hAnsi="Arial" w:cs="Arial"/>
+          <w:sz w:val="21"/>
+          <w:szCs w:val="21"/>
+          <w:lang w:val="pt-BR"/>
+        </w:rPr>
+      </w:pPr>
+    </w:p>
+    <w:p>
+      <w:pPr>
+        <w:rPr>
+          <w:rFonts w:ascii="Arial" w:hAnsi="Arial" w:cs="Arial"/>
+          <w:sz w:val="21"/>
+          <w:szCs w:val="21"/>
+          <w:lang w:val="pt-BR"/>
+        </w:rPr>
+      </w:pPr>
+      <w:r>
+        <w:rPr>
+          <w:rFonts w:ascii="Arial" w:hAnsi="Arial" w:cs="Arial"/>
+          <w:sz w:val="21"/>
+          <w:szCs w:val="21"/>
+          <w:lang w:val="pt-BR"/>
+        </w:rPr>
+        <w:tab/>
+      </w:r>
+      <w:r>
+        <w:rPr>
+          <w:rFonts w:ascii="Arial" w:hAnsi="Arial" w:cs="Arial"/>
+          <w:b/>
+          <w:bCs/>
+          <w:sz w:val="21"/>
+          <w:szCs w:val="21"/>
+          <w:lang w:val="pt-BR"/>
+        </w:rPr>
+        <w:t xml:space="preserve">DECLARACAOSELECAO </w:t>
+      </w:r>
+      <w:r>
+        <w:rPr>
+          <w:rFonts w:ascii="Arial" w:hAnsi="Arial" w:cs="Arial"/>
+          <w:b/>
+          <w:sz w:val="21"/>
+          <w:szCs w:val="21"/>
+          <w:lang w:val="pt-BR"/>
+        </w:rPr>
+        <w:t>=&gt;</w:t>
+      </w:r>
+      <w:r>
+        <w:rPr>
+          <w:rFonts w:ascii="Arial" w:hAnsi="Arial" w:cs="Arial"/>
+          <w:sz w:val="21"/>
+          <w:szCs w:val="21"/>
+          <w:lang w:val="pt-BR"/>
+        </w:rPr>
+        <w:t xml:space="preserve"> "if" "(" EXPRESSAOLOGICA ")" COMANDO ["else" COMANDO ]</w:t>
+      </w:r>
+    </w:p>
+    <w:p>
+      <w:pPr>
+        <w:rPr>
+          <w:rFonts w:ascii="Arial" w:hAnsi="Arial" w:cs="Arial"/>
+          <w:sz w:val="21"/>
+          <w:szCs w:val="21"/>
+          <w:lang w:val="pt-BR"/>
+        </w:rPr>
+      </w:pPr>
+    </w:p>
+    <w:p>
+      <w:pPr>
+        <w:rPr>
+          <w:rFonts w:ascii="Arial" w:hAnsi="Arial" w:cs="Arial"/>
+          <w:b/>
+          <w:bCs/>
+          <w:sz w:val="21"/>
+          <w:szCs w:val="21"/>
+          <w:lang w:val="pt-BR"/>
+        </w:rPr>
+      </w:pPr>
+      <w:r>
+        <w:rPr>
+          <w:rFonts w:ascii="Arial" w:hAnsi="Arial" w:cs="Arial"/>
+          <w:sz w:val="21"/>
+          <w:szCs w:val="21"/>
+          <w:lang w:val="pt-BR"/>
+        </w:rPr>
+        <w:tab/>
+      </w:r>
+      <w:r>
+        <w:rPr>
+          <w:rFonts w:ascii="Arial" w:hAnsi="Arial" w:cs="Arial"/>
+          <w:b/>
+          <w:bCs/>
+          <w:sz w:val="21"/>
+          <w:szCs w:val="21"/>
+          <w:lang w:val="pt-BR"/>
+        </w:rPr>
+        <w:t>--- Repetição</w:t>
+      </w:r>
+    </w:p>
+    <w:p>
+      <w:pPr>
+        <w:rPr>
+          <w:rFonts w:ascii="Arial" w:hAnsi="Arial" w:cs="Arial"/>
+          <w:b/>
+          <w:bCs/>
+          <w:sz w:val="21"/>
+          <w:szCs w:val="21"/>
+          <w:lang w:val="pt-BR"/>
+        </w:rPr>
+      </w:pPr>
+    </w:p>
+    <w:p>
+      <w:pPr>
+        <w:rPr>
+          <w:rFonts w:ascii="Arial" w:hAnsi="Arial" w:cs="Arial"/>
+          <w:sz w:val="21"/>
+          <w:szCs w:val="21"/>
+          <w:lang w:val="pt-BR"/>
+        </w:rPr>
+      </w:pPr>
+      <w:r>
+        <w:rPr>
+          <w:rFonts w:ascii="Arial" w:hAnsi="Arial" w:cs="Arial"/>
+          <w:sz w:val="21"/>
+          <w:szCs w:val="21"/>
+          <w:lang w:val="pt-BR"/>
+        </w:rPr>
+        <w:tab/>
+      </w:r>
+      <w:r>
+        <w:rPr>
+          <w:rFonts w:ascii="Arial" w:hAnsi="Arial" w:cs="Arial"/>
+          <w:b/>
+          <w:bCs/>
+          <w:sz w:val="21"/>
+          <w:szCs w:val="21"/>
+          <w:lang w:val="pt-BR"/>
+        </w:rPr>
+        <w:t xml:space="preserve">DECLARACAOITERACAO </w:t>
+      </w:r>
+      <w:r>
+        <w:rPr>
+          <w:rFonts w:ascii="Arial" w:hAnsi="Arial" w:cs="Arial"/>
+          <w:b/>
+          <w:sz w:val="21"/>
+          <w:szCs w:val="21"/>
+          <w:lang w:val="pt-BR"/>
+        </w:rPr>
+        <w:t>=&gt;</w:t>
+      </w:r>
+      <w:r>
+        <w:rPr>
+          <w:rFonts w:ascii="Arial" w:hAnsi="Arial" w:cs="Arial"/>
+          <w:sz w:val="21"/>
+          <w:szCs w:val="21"/>
+          <w:lang w:val="pt-BR"/>
+        </w:rPr>
+        <w:t xml:space="preserve"> "while" "(" EXPRESSAOLOGICA ")" COMANDO</w:t>
+      </w:r>
+    </w:p>
+    <w:p>
+      <w:pPr>
+        <w:rPr>
+          <w:rFonts w:ascii="Arial" w:hAnsi="Arial" w:cs="Arial"/>
+          <w:sz w:val="21"/>
+          <w:szCs w:val="21"/>
+          <w:lang w:val="pt-BR"/>
+        </w:rPr>
+      </w:pPr>
+    </w:p>
+    <w:p>
+      <w:pPr>
+        <w:rPr>
+          <w:rFonts w:ascii="Arial" w:hAnsi="Arial" w:cs="Arial"/>
+          <w:sz w:val="21"/>
+          <w:szCs w:val="21"/>
+          <w:lang w:val="pt-BR"/>
+        </w:rPr>
+      </w:pPr>
+    </w:p>
+    <w:p>
+      <w:pPr>
+        <w:rPr>
+          <w:rFonts w:ascii="Arial" w:hAnsi="Arial" w:cs="Arial"/>
+          <w:b/>
+          <w:bCs/>
+          <w:sz w:val="21"/>
+          <w:szCs w:val="21"/>
+          <w:lang w:val="pt-BR"/>
+        </w:rPr>
+      </w:pPr>
+      <w:r>
+        <w:rPr>
+          <w:rFonts w:ascii="Arial" w:hAnsi="Arial" w:cs="Arial"/>
+          <w:b/>
+          <w:bCs/>
+          <w:sz w:val="21"/>
+          <w:szCs w:val="21"/>
+          <w:lang w:val="pt-BR"/>
+        </w:rPr>
+        <w:t>--- Expressões Com Precedência</w:t>
+      </w:r>
+    </w:p>
+    <w:p>
+      <w:pPr>
+        <w:rPr>
+          <w:rFonts w:ascii="Arial" w:hAnsi="Arial" w:cs="Arial"/>
+          <w:b/>
+          <w:bCs/>
+          <w:sz w:val="21"/>
+          <w:szCs w:val="21"/>
+          <w:lang w:val="pt-BR"/>
+        </w:rPr>
+      </w:pPr>
+    </w:p>
+    <w:p>
+      <w:pPr>
+        <w:rPr>
+          <w:rFonts w:ascii="Arial" w:hAnsi="Arial" w:cs="Arial"/>
+          <w:sz w:val="21"/>
+          <w:szCs w:val="21"/>
+          <w:lang w:val="pt-BR"/>
+        </w:rPr>
+      </w:pPr>
+      <w:r>
+        <w:rPr>
+          <w:rFonts w:ascii="Arial" w:hAnsi="Arial" w:cs="Arial"/>
+          <w:b/>
+          <w:bCs/>
+          <w:sz w:val="21"/>
+          <w:szCs w:val="21"/>
+          <w:lang w:val="pt-BR"/>
+        </w:rPr>
+        <w:t xml:space="preserve">EXPRESSAOLOGICA </w:t>
+      </w:r>
+      <w:r>
+        <w:rPr>
+          <w:rFonts w:ascii="Arial" w:hAnsi="Arial" w:cs="Arial"/>
+          <w:b/>
+          <w:sz w:val="21"/>
+          <w:szCs w:val="21"/>
+          <w:lang w:val="pt-BR"/>
+        </w:rPr>
+        <w:t>=&gt;</w:t>
+      </w:r>
+      <w:r>
+        <w:rPr>
+          <w:rFonts w:ascii="Arial" w:hAnsi="Arial" w:cs="Arial"/>
+          <w:sz w:val="21"/>
+          <w:szCs w:val="21"/>
+          <w:lang w:val="pt-BR"/>
+        </w:rPr>
+        <w:t xml:space="preserve">  TERMOLOGICO { "||" TERMOLOGICO  }</w:t>
+      </w:r>
+    </w:p>
+    <w:p>
+      <w:pPr>
+        <w:rPr>
+          <w:rFonts w:ascii="Arial" w:hAnsi="Arial" w:cs="Arial"/>
+          <w:sz w:val="21"/>
+          <w:szCs w:val="21"/>
+          <w:lang w:val="pt-BR"/>
+        </w:rPr>
+      </w:pPr>
+      <w:r>
+        <w:rPr>
+          <w:rFonts w:ascii="Arial" w:hAnsi="Arial" w:cs="Arial"/>
+          <w:b/>
+          <w:bCs/>
+          <w:sz w:val="21"/>
+          <w:szCs w:val="21"/>
+          <w:lang w:val="pt-BR"/>
+        </w:rPr>
+        <w:t xml:space="preserve">CASTING =&gt; </w:t>
+      </w:r>
+      <w:r>
+        <w:rPr>
+          <w:rFonts w:ascii="Arial" w:hAnsi="Arial" w:cs="Arial"/>
+          <w:sz w:val="21"/>
+          <w:szCs w:val="21"/>
+          <w:lang w:val="pt-BR"/>
+        </w:rPr>
+        <w:t xml:space="preserve">“(” </w:t>
+      </w:r>
+      <w:r>
+        <w:rPr>
+          <w:rFonts w:ascii="Arial" w:hAnsi="Arial" w:cs="Arial"/>
+          <w:sz w:val="21"/>
+          <w:szCs w:val="21"/>
+          <w:lang w:val="pt-BR"/>
+        </w:rPr>
+        <w:t xml:space="preserve">TIPOVARIAVEL </w:t>
+      </w:r>
+      <w:r>
+        <w:rPr>
+          <w:rFonts w:ascii="Arial" w:hAnsi="Arial" w:cs="Arial"/>
+          <w:sz w:val="21"/>
+          <w:szCs w:val="21"/>
+          <w:lang w:val="pt-BR"/>
+        </w:rPr>
+        <w:t>”)”</w:t>
+      </w:r>
+    </w:p>
+    <w:p>
+      <w:pPr>
+        <w:rPr>
+          <w:rFonts w:ascii="Arial" w:hAnsi="Arial" w:cs="Arial"/>
+          <w:sz w:val="21"/>
+          <w:szCs w:val="21"/>
+          <w:lang w:val="pt-BR"/>
+        </w:rPr>
+      </w:pPr>
+      <w:r>
+        <w:rPr>
+          <w:rFonts w:ascii="Arial" w:hAnsi="Arial" w:cs="Arial"/>
+          <w:b/>
+          <w:bCs/>
+          <w:sz w:val="21"/>
+          <w:szCs w:val="21"/>
+          <w:lang w:val="pt-BR"/>
+        </w:rPr>
+        <w:t xml:space="preserve">TERMOLOGICO </w:t>
+      </w:r>
+      <w:r>
+        <w:rPr>
+          <w:rFonts w:ascii="Arial" w:hAnsi="Arial" w:cs="Arial"/>
+          <w:b/>
+          <w:sz w:val="21"/>
+          <w:szCs w:val="21"/>
+          <w:lang w:val="pt-BR"/>
+        </w:rPr>
+        <w:t>=&gt;</w:t>
+      </w:r>
+      <w:r>
+        <w:rPr>
+          <w:rFonts w:ascii="Arial" w:hAnsi="Arial" w:cs="Arial"/>
+          <w:b/>
+          <w:bCs/>
           <w:sz w:val="21"/>
           <w:szCs w:val="21"/>
           <w:lang w:val="pt-BR"/>
@@ -458,121 +1040,77 @@
           <w:szCs w:val="21"/>
           <w:lang w:val="pt-BR"/>
         </w:rPr>
-        <w:t>"double"</w:t>
-      </w:r>
-    </w:p>
-    <w:p>
-      <w:pPr>
-        <w:rPr>
-          <w:rFonts w:ascii="Arial" w:hAnsi="Arial" w:eastAsia="sans-serif" w:cs="Arial"/>
-          <w:color w:val="3F3F3F"/>
-          <w:sz w:val="21"/>
-          <w:szCs w:val="21"/>
-          <w:shd w:val="clear" w:color="auto" w:fill="FFFFFF"/>
-          <w:lang w:val="pt-BR"/>
-        </w:rPr>
-      </w:pPr>
-      <w:r>
-        <w:rPr>
-          <w:rFonts w:ascii="Arial" w:hAnsi="Arial" w:eastAsia="sans-serif" w:cs="Arial"/>
-          <w:b/>
-          <w:bCs/>
-          <w:color w:val="3F3F3F"/>
-          <w:sz w:val="21"/>
-          <w:szCs w:val="21"/>
-          <w:shd w:val="clear" w:color="auto" w:fill="FFFFFF"/>
-          <w:lang w:val="pt-BR"/>
-        </w:rPr>
-        <w:t xml:space="preserve">DECLARACAOVARIAVEL </w:t>
-      </w:r>
-      <w:r>
-        <w:rPr>
-          <w:rFonts w:ascii="Arial" w:hAnsi="Arial" w:eastAsia="sans-serif" w:cs="Arial"/>
-          <w:b/>
-          <w:color w:val="3F3F3F"/>
-          <w:sz w:val="21"/>
-          <w:szCs w:val="21"/>
-          <w:shd w:val="clear" w:color="auto" w:fill="FFFFFF"/>
+        <w:t>EXPRESSAORELACIONAL { “&amp;&amp;” EXPRESSAORELACIONAL }</w:t>
+      </w:r>
+    </w:p>
+    <w:p>
+      <w:pPr>
+        <w:rPr>
+          <w:rFonts w:ascii="Arial" w:hAnsi="Arial" w:cs="Arial"/>
+          <w:sz w:val="21"/>
+          <w:szCs w:val="21"/>
+          <w:lang w:val="pt-BR"/>
+        </w:rPr>
+      </w:pPr>
+      <w:r>
+        <w:rPr>
+          <w:rFonts w:ascii="Arial" w:hAnsi="Arial" w:cs="Arial"/>
+          <w:b/>
+          <w:bCs/>
+          <w:sz w:val="21"/>
+          <w:szCs w:val="21"/>
+          <w:lang w:val="pt-BR"/>
+        </w:rPr>
+        <w:t xml:space="preserve">EXPRESSAORELACIONAL </w:t>
+      </w:r>
+      <w:r>
+        <w:rPr>
+          <w:rFonts w:ascii="Arial" w:hAnsi="Arial" w:cs="Arial"/>
+          <w:b/>
+          <w:sz w:val="21"/>
+          <w:szCs w:val="21"/>
           <w:lang w:val="pt-BR"/>
         </w:rPr>
         <w:t>=&gt;</w:t>
       </w:r>
       <w:r>
         <w:rPr>
-          <w:rFonts w:ascii="Arial" w:hAnsi="Arial" w:eastAsia="sans-serif" w:cs="Arial"/>
-          <w:color w:val="3F3F3F"/>
-          <w:sz w:val="21"/>
-          <w:szCs w:val="21"/>
-          <w:shd w:val="clear" w:color="auto" w:fill="FFFFFF"/>
-          <w:lang w:val="pt-BR"/>
-        </w:rPr>
-        <w:t xml:space="preserve"> TIPOVARIAVEL IDENTIFICADOR [ "=" EXPRESSAOLOGICA ] { "," IDENTIFICADOR [ "=" EXPRESSAOLOGICA ]} ";"</w:t>
-      </w:r>
-    </w:p>
-    <w:p>
-      <w:pPr>
-        <w:rPr>
-          <w:rFonts w:ascii="Arial" w:hAnsi="Arial" w:eastAsia="sans-serif" w:cs="Arial"/>
-          <w:color w:val="3F3F3F"/>
-          <w:sz w:val="21"/>
-          <w:szCs w:val="21"/>
-          <w:shd w:val="clear" w:color="auto" w:fill="FFFFFF"/>
-          <w:lang w:val="pt-BR"/>
-        </w:rPr>
-      </w:pPr>
-    </w:p>
-    <w:p>
-      <w:pPr>
-        <w:rPr>
-          <w:rFonts w:ascii="Arial" w:hAnsi="Arial" w:cs="Arial"/>
-          <w:b/>
-          <w:bCs/>
-          <w:sz w:val="21"/>
-          <w:szCs w:val="21"/>
-          <w:lang w:val="pt-BR"/>
-        </w:rPr>
-      </w:pPr>
-      <w:r>
-        <w:rPr>
-          <w:rFonts w:ascii="Arial" w:hAnsi="Arial" w:cs="Arial"/>
-          <w:b/>
-          <w:bCs/>
-          <w:sz w:val="21"/>
-          <w:szCs w:val="21"/>
-          <w:lang w:val="pt-BR"/>
-        </w:rPr>
-        <w:t>--- Atribuição</w:t>
-      </w:r>
-    </w:p>
-    <w:p>
-      <w:pPr>
-        <w:rPr>
-          <w:rFonts w:ascii="Arial" w:hAnsi="Arial" w:cs="Arial"/>
-          <w:sz w:val="21"/>
-          <w:szCs w:val="21"/>
-          <w:lang w:val="pt-BR"/>
-        </w:rPr>
-      </w:pPr>
-    </w:p>
-    <w:p>
-      <w:pPr>
-        <w:rPr>
-          <w:rFonts w:ascii="Arial" w:hAnsi="Arial" w:cs="Arial"/>
-          <w:sz w:val="21"/>
-          <w:szCs w:val="21"/>
-          <w:lang w:val="pt-BR"/>
-        </w:rPr>
-      </w:pPr>
-      <w:r>
-        <w:rPr>
-          <w:rFonts w:ascii="Arial" w:hAnsi="Arial" w:cs="Arial"/>
-          <w:b/>
-          <w:bCs/>
-          <w:sz w:val="21"/>
-          <w:szCs w:val="21"/>
-          <w:lang w:val="pt-BR"/>
-        </w:rPr>
-        <w:t xml:space="preserve">DECLARACAOATRIBUICAO </w:t>
+          <w:rFonts w:ascii="Arial" w:hAnsi="Arial" w:cs="Arial"/>
+          <w:sz w:val="21"/>
+          <w:szCs w:val="21"/>
+          <w:lang w:val="pt-BR"/>
+        </w:rPr>
+        <w:t xml:space="preserve"> </w:t>
+      </w:r>
+      <w:r>
+        <w:rPr>
+          <w:rFonts w:ascii="Arial" w:hAnsi="Arial" w:cs="Arial"/>
+          <w:sz w:val="21"/>
+          <w:szCs w:val="21"/>
+          <w:lang w:val="pt-BR"/>
+        </w:rPr>
+        <w:t xml:space="preserve">EXPRESSAOARITMETICA [ OPERADORRELACIONAL EXPRESSAOARITMETICA ] </w:t>
+      </w:r>
+    </w:p>
+    <w:p>
+      <w:pPr>
+        <w:rPr>
+          <w:rFonts w:ascii="Arial" w:hAnsi="Arial" w:cs="Arial"/>
+          <w:sz w:val="21"/>
+          <w:szCs w:val="21"/>
+          <w:lang w:val="pt-BR"/>
+        </w:rPr>
+      </w:pPr>
+      <w:r>
+        <w:rPr>
+          <w:rFonts w:ascii="Arial" w:hAnsi="Arial" w:cs="Arial"/>
+          <w:b/>
+          <w:bCs/>
+          <w:sz w:val="21"/>
+          <w:szCs w:val="21"/>
+          <w:lang w:val="pt-BR"/>
+        </w:rPr>
+        <w:t xml:space="preserve">EXPRESSAOARITMETICA </w:t>
       </w:r>
       <w:r>
         <w:rPr>
@@ -591,159 +1129,82 @@
           <w:szCs w:val="21"/>
           <w:lang w:val="pt-BR"/>
         </w:rPr>
-        <w:t xml:space="preserve"> IDENTIFICADOR "=" EXPRESSAOLOGICA ";" </w:t>
-      </w:r>
-    </w:p>
-    <w:p>
-      <w:pPr>
-        <w:rPr>
-          <w:rFonts w:ascii="Arial" w:hAnsi="Arial" w:cs="Arial"/>
-          <w:sz w:val="21"/>
-          <w:szCs w:val="21"/>
-          <w:lang w:val="pt-BR"/>
-        </w:rPr>
-      </w:pPr>
-    </w:p>
-    <w:p>
-      <w:pPr>
-        <w:rPr>
-          <w:rFonts w:ascii="Arial" w:hAnsi="Arial" w:cs="Arial"/>
-          <w:sz w:val="21"/>
-          <w:szCs w:val="21"/>
-          <w:lang w:val="pt-BR"/>
-        </w:rPr>
-      </w:pPr>
-      <w:r>
-        <w:rPr>
-          <w:rFonts w:ascii="Arial" w:hAnsi="Arial" w:cs="Arial"/>
-          <w:b/>
-          <w:sz w:val="21"/>
-          <w:szCs w:val="21"/>
-          <w:lang w:val="pt-BR"/>
-        </w:rPr>
-        <w:t>DECLARACAORETORNO =&gt;</w:t>
-      </w:r>
-      <w:r>
-        <w:rPr>
-          <w:rFonts w:ascii="Arial" w:hAnsi="Arial" w:cs="Arial"/>
-          <w:sz w:val="21"/>
-          <w:szCs w:val="21"/>
-          <w:lang w:val="pt-BR"/>
-        </w:rPr>
-        <w:t xml:space="preserve"> “return” EXPRESSAOLOGICA “;”</w:t>
-      </w:r>
-    </w:p>
-    <w:p>
-      <w:pPr>
-        <w:rPr>
-          <w:rFonts w:ascii="Arial" w:hAnsi="Arial" w:cs="Arial"/>
-          <w:sz w:val="21"/>
-          <w:szCs w:val="21"/>
-          <w:lang w:val="pt-BR"/>
-        </w:rPr>
-      </w:pPr>
-    </w:p>
-    <w:p>
-      <w:pPr>
-        <w:rPr>
-          <w:rFonts w:ascii="Arial" w:hAnsi="Arial" w:cs="Arial"/>
-          <w:b/>
-          <w:bCs/>
-          <w:sz w:val="21"/>
-          <w:szCs w:val="21"/>
-          <w:lang w:val="pt-BR"/>
-        </w:rPr>
-      </w:pPr>
-      <w:r>
-        <w:rPr>
-          <w:rFonts w:ascii="Arial" w:hAnsi="Arial" w:cs="Arial"/>
-          <w:b/>
-          <w:bCs/>
-          <w:sz w:val="21"/>
-          <w:szCs w:val="21"/>
-          <w:lang w:val="pt-BR"/>
-        </w:rPr>
-        <w:t>--- Estruturas de Controle</w:t>
-      </w:r>
-    </w:p>
-    <w:p>
-      <w:pPr>
-        <w:rPr>
-          <w:rFonts w:ascii="Arial" w:hAnsi="Arial" w:cs="Arial"/>
-          <w:sz w:val="21"/>
-          <w:szCs w:val="21"/>
-          <w:lang w:val="pt-BR"/>
-        </w:rPr>
-      </w:pPr>
-    </w:p>
-    <w:p>
-      <w:pPr>
-        <w:rPr>
-          <w:rFonts w:ascii="Arial" w:hAnsi="Arial" w:cs="Arial"/>
-          <w:sz w:val="21"/>
-          <w:szCs w:val="21"/>
-          <w:lang w:val="pt-BR"/>
-        </w:rPr>
-      </w:pPr>
-      <w:r>
-        <w:rPr>
-          <w:rFonts w:ascii="Arial" w:hAnsi="Arial" w:cs="Arial"/>
-          <w:sz w:val="21"/>
-          <w:szCs w:val="21"/>
-          <w:lang w:val="pt-BR"/>
-        </w:rPr>
-        <w:tab/>
-      </w:r>
-      <w:r>
-        <w:rPr>
-          <w:rFonts w:ascii="Arial" w:hAnsi="Arial" w:cs="Arial"/>
-          <w:b/>
-          <w:bCs/>
-          <w:sz w:val="21"/>
-          <w:szCs w:val="21"/>
-          <w:lang w:val="pt-BR"/>
-        </w:rPr>
-        <w:t>--- Condicional</w:t>
-      </w:r>
-    </w:p>
-    <w:p>
-      <w:pPr>
-        <w:rPr>
-          <w:rFonts w:ascii="Arial" w:hAnsi="Arial" w:cs="Arial"/>
-          <w:sz w:val="21"/>
-          <w:szCs w:val="21"/>
-          <w:lang w:val="pt-BR"/>
-        </w:rPr>
-      </w:pPr>
-    </w:p>
-    <w:p>
-      <w:pPr>
-        <w:rPr>
-          <w:rFonts w:ascii="Arial" w:hAnsi="Arial" w:cs="Arial"/>
-          <w:sz w:val="21"/>
-          <w:szCs w:val="21"/>
-          <w:lang w:val="pt-BR"/>
-        </w:rPr>
-      </w:pPr>
-      <w:r>
-        <w:rPr>
-          <w:rFonts w:ascii="Arial" w:hAnsi="Arial" w:cs="Arial"/>
-          <w:sz w:val="21"/>
-          <w:szCs w:val="21"/>
-          <w:lang w:val="pt-BR"/>
-        </w:rPr>
-        <w:tab/>
-      </w:r>
-      <w:r>
-        <w:rPr>
-          <w:rFonts w:ascii="Arial" w:hAnsi="Arial" w:cs="Arial"/>
-          <w:b/>
-          <w:bCs/>
-          <w:sz w:val="21"/>
-          <w:szCs w:val="21"/>
-          <w:lang w:val="pt-BR"/>
-        </w:rPr>
-        <w:t xml:space="preserve">DECLARACAOSELECAO </w:t>
+        <w:t xml:space="preserve"> </w:t>
+      </w:r>
+      <w:r>
+        <w:rPr>
+          <w:rFonts w:ascii="Arial" w:hAnsi="Arial" w:cs="Arial"/>
+          <w:sz w:val="21"/>
+          <w:szCs w:val="21"/>
+          <w:lang w:val="pt-BR"/>
+        </w:rPr>
+        <w:t>[ CASTING ]</w:t>
+      </w:r>
+      <w:r>
+        <w:rPr>
+          <w:rFonts w:ascii="Arial" w:hAnsi="Arial" w:cs="Arial"/>
+          <w:sz w:val="21"/>
+          <w:szCs w:val="21"/>
+          <w:lang w:val="pt-BR"/>
+        </w:rPr>
+        <w:t xml:space="preserve"> </w:t>
+      </w:r>
+      <w:r>
+        <w:rPr>
+          <w:rFonts w:ascii="Arial" w:hAnsi="Arial" w:cs="Arial"/>
+          <w:sz w:val="21"/>
+          <w:szCs w:val="21"/>
+          <w:lang w:val="pt-BR"/>
+        </w:rPr>
+        <w:t xml:space="preserve">TERMO { ( “+” | “-” ) </w:t>
+      </w:r>
+      <w:r>
+        <w:rPr>
+          <w:rFonts w:ascii="Arial" w:hAnsi="Arial" w:cs="Arial"/>
+          <w:sz w:val="21"/>
+          <w:szCs w:val="21"/>
+          <w:lang w:val="pt-BR"/>
+        </w:rPr>
+        <w:t>[ CASTING ]</w:t>
+      </w:r>
+      <w:r>
+        <w:rPr>
+          <w:rFonts w:ascii="Arial" w:hAnsi="Arial" w:cs="Arial"/>
+          <w:sz w:val="21"/>
+          <w:szCs w:val="21"/>
+          <w:lang w:val="pt-BR"/>
+        </w:rPr>
+        <w:t xml:space="preserve"> </w:t>
+      </w:r>
+      <w:r>
+        <w:rPr>
+          <w:rFonts w:ascii="Arial" w:hAnsi="Arial" w:cs="Arial"/>
+          <w:sz w:val="21"/>
+          <w:szCs w:val="21"/>
+          <w:lang w:val="pt-BR"/>
+        </w:rPr>
+        <w:t>TERMO }</w:t>
+      </w:r>
+    </w:p>
+    <w:p>
+      <w:pPr>
+        <w:rPr>
+          <w:rFonts w:ascii="Arial" w:hAnsi="Arial" w:cs="Arial"/>
+          <w:sz w:val="21"/>
+          <w:szCs w:val="21"/>
+          <w:lang w:val="pt-BR"/>
+        </w:rPr>
+      </w:pPr>
+      <w:r>
+        <w:rPr>
+          <w:rFonts w:ascii="Arial" w:hAnsi="Arial" w:cs="Arial"/>
+          <w:b/>
+          <w:bCs/>
+          <w:sz w:val="21"/>
+          <w:szCs w:val="21"/>
+          <w:lang w:val="pt-BR"/>
+        </w:rPr>
+        <w:t xml:space="preserve">TERMO </w:t>
       </w:r>
       <w:r>
         <w:rPr>
@@ -762,246 +1223,6 @@
           <w:szCs w:val="21"/>
           <w:lang w:val="pt-BR"/>
         </w:rPr>
-        <w:t xml:space="preserve"> "if" "(" EXPRESSAOLOGICA ")" COMANDO ["else" COMANDO ]</w:t>
-      </w:r>
-    </w:p>
-    <w:p>
-      <w:pPr>
-        <w:rPr>
-          <w:rFonts w:ascii="Arial" w:hAnsi="Arial" w:cs="Arial"/>
-          <w:sz w:val="21"/>
-          <w:szCs w:val="21"/>
-          <w:lang w:val="pt-BR"/>
-        </w:rPr>
-      </w:pPr>
-    </w:p>
-    <w:p>
-      <w:pPr>
-        <w:rPr>
-          <w:rFonts w:ascii="Arial" w:hAnsi="Arial" w:cs="Arial"/>
-          <w:b/>
-          <w:bCs/>
-          <w:sz w:val="21"/>
-          <w:szCs w:val="21"/>
-          <w:lang w:val="pt-BR"/>
-        </w:rPr>
-      </w:pPr>
-      <w:r>
-        <w:rPr>
-          <w:rFonts w:ascii="Arial" w:hAnsi="Arial" w:cs="Arial"/>
-          <w:sz w:val="21"/>
-          <w:szCs w:val="21"/>
-          <w:lang w:val="pt-BR"/>
-        </w:rPr>
-        <w:tab/>
-      </w:r>
-      <w:r>
-        <w:rPr>
-          <w:rFonts w:ascii="Arial" w:hAnsi="Arial" w:cs="Arial"/>
-          <w:b/>
-          <w:bCs/>
-          <w:sz w:val="21"/>
-          <w:szCs w:val="21"/>
-          <w:lang w:val="pt-BR"/>
-        </w:rPr>
-        <w:t>--- Repetição</w:t>
-      </w:r>
-    </w:p>
-    <w:p>
-      <w:pPr>
-        <w:rPr>
-          <w:rFonts w:ascii="Arial" w:hAnsi="Arial" w:cs="Arial"/>
-          <w:b/>
-          <w:bCs/>
-          <w:sz w:val="21"/>
-          <w:szCs w:val="21"/>
-          <w:lang w:val="pt-BR"/>
-        </w:rPr>
-      </w:pPr>
-    </w:p>
-    <w:p>
-      <w:pPr>
-        <w:rPr>
-          <w:rFonts w:ascii="Arial" w:hAnsi="Arial" w:cs="Arial"/>
-          <w:sz w:val="21"/>
-          <w:szCs w:val="21"/>
-          <w:lang w:val="pt-BR"/>
-        </w:rPr>
-      </w:pPr>
-      <w:r>
-        <w:rPr>
-          <w:rFonts w:ascii="Arial" w:hAnsi="Arial" w:cs="Arial"/>
-          <w:sz w:val="21"/>
-          <w:szCs w:val="21"/>
-          <w:lang w:val="pt-BR"/>
-        </w:rPr>
-        <w:tab/>
-      </w:r>
-      <w:r>
-        <w:rPr>
-          <w:rFonts w:ascii="Arial" w:hAnsi="Arial" w:cs="Arial"/>
-          <w:b/>
-          <w:bCs/>
-          <w:sz w:val="21"/>
-          <w:szCs w:val="21"/>
-          <w:lang w:val="pt-BR"/>
-        </w:rPr>
-        <w:t xml:space="preserve">DECLARACAOITERACAO </w:t>
-      </w:r>
-      <w:r>
-        <w:rPr>
-          <w:rFonts w:ascii="Arial" w:hAnsi="Arial" w:cs="Arial"/>
-          <w:b/>
-          <w:sz w:val="21"/>
-          <w:szCs w:val="21"/>
-          <w:lang w:val="pt-BR"/>
-        </w:rPr>
-        <w:t>=&gt;</w:t>
-      </w:r>
-      <w:r>
-        <w:rPr>
-          <w:rFonts w:ascii="Arial" w:hAnsi="Arial" w:cs="Arial"/>
-          <w:sz w:val="21"/>
-          <w:szCs w:val="21"/>
-          <w:lang w:val="pt-BR"/>
-        </w:rPr>
-        <w:t xml:space="preserve"> "while" "(" EXPRESSAOLOGICA ")" COMANDO</w:t>
-      </w:r>
-    </w:p>
-    <w:p>
-      <w:pPr>
-        <w:rPr>
-          <w:rFonts w:ascii="Arial" w:hAnsi="Arial" w:cs="Arial"/>
-          <w:sz w:val="21"/>
-          <w:szCs w:val="21"/>
-          <w:lang w:val="pt-BR"/>
-        </w:rPr>
-      </w:pPr>
-    </w:p>
-    <w:p>
-      <w:pPr>
-        <w:rPr>
-          <w:rFonts w:ascii="Arial" w:hAnsi="Arial" w:cs="Arial"/>
-          <w:sz w:val="21"/>
-          <w:szCs w:val="21"/>
-          <w:lang w:val="pt-BR"/>
-        </w:rPr>
-      </w:pPr>
-    </w:p>
-    <w:p>
-      <w:pPr>
-        <w:rPr>
-          <w:rFonts w:ascii="Arial" w:hAnsi="Arial" w:cs="Arial"/>
-          <w:b/>
-          <w:bCs/>
-          <w:sz w:val="21"/>
-          <w:szCs w:val="21"/>
-          <w:lang w:val="pt-BR"/>
-        </w:rPr>
-      </w:pPr>
-      <w:r>
-        <w:rPr>
-          <w:rFonts w:ascii="Arial" w:hAnsi="Arial" w:cs="Arial"/>
-          <w:b/>
-          <w:bCs/>
-          <w:sz w:val="21"/>
-          <w:szCs w:val="21"/>
-          <w:lang w:val="pt-BR"/>
-        </w:rPr>
-        <w:t>--- Expressões Com Precedência</w:t>
-      </w:r>
-    </w:p>
-    <w:p>
-      <w:pPr>
-        <w:rPr>
-          <w:rFonts w:ascii="Arial" w:hAnsi="Arial" w:cs="Arial"/>
-          <w:b/>
-          <w:bCs/>
-          <w:sz w:val="21"/>
-          <w:szCs w:val="21"/>
-          <w:lang w:val="pt-BR"/>
-        </w:rPr>
-      </w:pPr>
-    </w:p>
-    <w:p>
-      <w:pPr>
-        <w:rPr>
-          <w:rFonts w:ascii="Arial" w:hAnsi="Arial" w:cs="Arial"/>
-          <w:sz w:val="21"/>
-          <w:szCs w:val="21"/>
-          <w:lang w:val="pt-BR"/>
-        </w:rPr>
-      </w:pPr>
-      <w:r>
-        <w:rPr>
-          <w:rFonts w:ascii="Arial" w:hAnsi="Arial" w:cs="Arial"/>
-          <w:b/>
-          <w:bCs/>
-          <w:sz w:val="21"/>
-          <w:szCs w:val="21"/>
-          <w:lang w:val="pt-BR"/>
-        </w:rPr>
-        <w:t xml:space="preserve">EXPRESSAOLOGICA </w:t>
-      </w:r>
-      <w:r>
-        <w:rPr>
-          <w:rFonts w:ascii="Arial" w:hAnsi="Arial" w:cs="Arial"/>
-          <w:b/>
-          <w:sz w:val="21"/>
-          <w:szCs w:val="21"/>
-          <w:lang w:val="pt-BR"/>
-        </w:rPr>
-        <w:t>=&gt;</w:t>
-      </w:r>
-      <w:r>
-        <w:rPr>
-          <w:rFonts w:ascii="Arial" w:hAnsi="Arial" w:cs="Arial"/>
-          <w:sz w:val="21"/>
-          <w:szCs w:val="21"/>
-          <w:lang w:val="pt-BR"/>
-        </w:rPr>
-        <w:t xml:space="preserve">  TERMOLOGICO { "||" TERMOLOGICO  }</w:t>
-      </w:r>
-    </w:p>
-    <w:p>
-      <w:pPr>
-        <w:rPr>
-          <w:rFonts w:ascii="Arial" w:hAnsi="Arial" w:cs="Arial"/>
-          <w:sz w:val="21"/>
-          <w:szCs w:val="21"/>
-          <w:lang w:val="pt-BR"/>
-        </w:rPr>
-      </w:pPr>
-      <w:r>
-        <w:rPr>
-          <w:rFonts w:ascii="Arial" w:hAnsi="Arial" w:cs="Arial"/>
-          <w:b/>
-          <w:bCs/>
-          <w:sz w:val="21"/>
-          <w:szCs w:val="21"/>
-          <w:lang w:val="pt-BR"/>
-        </w:rPr>
-        <w:t xml:space="preserve">TERMOLOGICO </w:t>
-      </w:r>
-      <w:r>
-        <w:rPr>
-          <w:rFonts w:ascii="Arial" w:hAnsi="Arial" w:cs="Arial"/>
-          <w:b/>
-          <w:sz w:val="21"/>
-          <w:szCs w:val="21"/>
-          <w:lang w:val="pt-BR"/>
-        </w:rPr>
-        <w:t>=&gt;</w:t>
-      </w:r>
-      <w:r>
-        <w:rPr>
-          <w:rFonts w:ascii="Arial" w:hAnsi="Arial" w:cs="Arial"/>
-          <w:b/>
-          <w:bCs/>
-          <w:sz w:val="21"/>
-          <w:szCs w:val="21"/>
-          <w:lang w:val="pt-BR"/>
-        </w:rPr>
         <w:t xml:space="preserve"> </w:t>
       </w:r>
       <w:r>
@@ -1011,127 +1232,25 @@
           <w:szCs w:val="21"/>
           <w:lang w:val="pt-BR"/>
         </w:rPr>
-        <w:t>EXPRESSAORELACIONAL { “&amp;&amp;” EXPRESSAORELACIONAL }</w:t>
-      </w:r>
-    </w:p>
-    <w:p>
-      <w:pPr>
-        <w:rPr>
-          <w:rFonts w:ascii="Arial" w:hAnsi="Arial" w:cs="Arial"/>
-          <w:sz w:val="21"/>
-          <w:szCs w:val="21"/>
-          <w:lang w:val="pt-BR"/>
-        </w:rPr>
-      </w:pPr>
-      <w:r>
-        <w:rPr>
-          <w:rFonts w:ascii="Arial" w:hAnsi="Arial" w:cs="Arial"/>
-          <w:b/>
-          <w:bCs/>
-          <w:sz w:val="21"/>
-          <w:szCs w:val="21"/>
-          <w:lang w:val="pt-BR"/>
-        </w:rPr>
-        <w:t xml:space="preserve">EXPRESSAORELACIONAL </w:t>
-      </w:r>
-      <w:r>
-        <w:rPr>
-          <w:rFonts w:ascii="Arial" w:hAnsi="Arial" w:cs="Arial"/>
-          <w:b/>
-          <w:sz w:val="21"/>
-          <w:szCs w:val="21"/>
-          <w:lang w:val="pt-BR"/>
-        </w:rPr>
-        <w:t>=&gt;</w:t>
-      </w:r>
-      <w:r>
-        <w:rPr>
-          <w:rFonts w:ascii="Arial" w:hAnsi="Arial" w:cs="Arial"/>
-          <w:sz w:val="21"/>
-          <w:szCs w:val="21"/>
-          <w:lang w:val="pt-BR"/>
-        </w:rPr>
-        <w:t xml:space="preserve"> EXPRESSAOARITMETICA [ OPERADORRELACIONAL EXPRESSAOARITMETICA ] </w:t>
-      </w:r>
-    </w:p>
-    <w:p>
-      <w:pPr>
-        <w:rPr>
-          <w:rFonts w:ascii="Arial" w:hAnsi="Arial" w:cs="Arial"/>
-          <w:sz w:val="21"/>
-          <w:szCs w:val="21"/>
-          <w:lang w:val="pt-BR"/>
-        </w:rPr>
-      </w:pPr>
-      <w:r>
-        <w:rPr>
-          <w:rFonts w:ascii="Arial" w:hAnsi="Arial" w:cs="Arial"/>
-          <w:b/>
-          <w:bCs/>
-          <w:sz w:val="21"/>
-          <w:szCs w:val="21"/>
-          <w:lang w:val="pt-BR"/>
-        </w:rPr>
-        <w:t xml:space="preserve">EXPRESSAOARITMETICA </w:t>
-      </w:r>
-      <w:r>
-        <w:rPr>
-          <w:rFonts w:ascii="Arial" w:hAnsi="Arial" w:cs="Arial"/>
-          <w:b/>
-          <w:sz w:val="21"/>
-          <w:szCs w:val="21"/>
-          <w:lang w:val="pt-BR"/>
-        </w:rPr>
-        <w:t>=&gt;</w:t>
-      </w:r>
-      <w:r>
-        <w:rPr>
-          <w:rFonts w:ascii="Arial" w:hAnsi="Arial" w:cs="Arial"/>
-          <w:sz w:val="21"/>
-          <w:szCs w:val="21"/>
-          <w:lang w:val="pt-BR"/>
-        </w:rPr>
-        <w:t xml:space="preserve"> TERMO { ( “+” | “-” ) TERMO }</w:t>
-      </w:r>
-    </w:p>
-    <w:p>
-      <w:pPr>
-        <w:rPr>
-          <w:rFonts w:ascii="Arial" w:hAnsi="Arial" w:cs="Arial"/>
-          <w:sz w:val="21"/>
-          <w:szCs w:val="21"/>
-          <w:lang w:val="pt-BR"/>
-        </w:rPr>
-      </w:pPr>
-      <w:r>
-        <w:rPr>
-          <w:rFonts w:ascii="Arial" w:hAnsi="Arial" w:cs="Arial"/>
-          <w:b/>
-          <w:bCs/>
-          <w:sz w:val="21"/>
-          <w:szCs w:val="21"/>
-          <w:lang w:val="pt-BR"/>
-        </w:rPr>
-        <w:t xml:space="preserve">TERMO </w:t>
-      </w:r>
-      <w:r>
-        <w:rPr>
-          <w:rFonts w:ascii="Arial" w:hAnsi="Arial" w:cs="Arial"/>
-          <w:b/>
-          <w:sz w:val="21"/>
-          <w:szCs w:val="21"/>
-          <w:lang w:val="pt-BR"/>
-        </w:rPr>
-        <w:t>=&gt;</w:t>
-      </w:r>
-      <w:r>
-        <w:rPr>
-          <w:rFonts w:ascii="Arial" w:hAnsi="Arial" w:cs="Arial"/>
-          <w:sz w:val="21"/>
-          <w:szCs w:val="21"/>
-          <w:lang w:val="pt-BR"/>
-        </w:rPr>
-        <w:t xml:space="preserve"> VALOR { ( “*” | “/” | “%” ) VALOR }</w:t>
+        <w:t>VALOR { ( “*” | “/” | “%” )</w:t>
+      </w:r>
+      <w:r>
+        <w:rPr>
+          <w:rFonts w:ascii="Arial" w:hAnsi="Arial" w:cs="Arial"/>
+          <w:sz w:val="21"/>
+          <w:szCs w:val="21"/>
+          <w:lang w:val="pt-BR"/>
+        </w:rPr>
+        <w:t xml:space="preserve"> </w:t>
+      </w:r>
+      <w:r>
+        <w:rPr>
+          <w:rFonts w:ascii="Arial" w:hAnsi="Arial" w:cs="Arial"/>
+          <w:sz w:val="21"/>
+          <w:szCs w:val="21"/>
+          <w:lang w:val="pt-BR"/>
+        </w:rPr>
+        <w:t>VALOR }</w:t>
       </w:r>
     </w:p>
     <w:p>
@@ -1466,7 +1585,6 @@
           <w:bCs/>
           <w:sz w:val="21"/>
           <w:szCs w:val="21"/>
-          <w:lang w:val="pt-BR"/>
         </w:rPr>
         <w:t>PROGRAMA</w:t>
       </w:r>
@@ -1549,7 +1667,6 @@
           <w:rFonts w:ascii="Arial" w:hAnsi="Arial"/>
           <w:sz w:val="21"/>
           <w:szCs w:val="21"/>
-          <w:lang w:val="pt-BR"/>
         </w:rPr>
         <w:t xml:space="preserve"> "return",</w:t>
       </w:r>
@@ -1599,7 +1716,6 @@
           <w:bCs/>
           <w:sz w:val="21"/>
           <w:szCs w:val="21"/>
-          <w:lang w:val="pt-BR"/>
         </w:rPr>
         <w:t>TIPOVARIAVEL</w:t>
       </w:r>
@@ -1626,7 +1742,6 @@
           <w:rFonts w:ascii="Arial" w:hAnsi="Arial"/>
           <w:sz w:val="21"/>
           <w:szCs w:val="21"/>
-          <w:lang w:val="pt-BR"/>
         </w:rPr>
         <w:t xml:space="preserve"> </w:t>
       </w:r>
@@ -1670,7 +1785,6 @@
           <w:rFonts w:ascii="Arial" w:hAnsi="Arial"/>
           <w:sz w:val="21"/>
           <w:szCs w:val="21"/>
-          <w:lang w:val="pt-BR"/>
         </w:rPr>
         <w:t>,</w:t>
       </w:r>
@@ -1689,17 +1803,15 @@
           <w:rFonts w:ascii="Arial" w:hAnsi="Arial"/>
           <w:sz w:val="21"/>
           <w:szCs w:val="21"/>
-          <w:lang w:val="pt-BR"/>
-        </w:rPr>
-      </w:pPr>
-      <w:r>
-        <w:rPr>
-          <w:rFonts w:ascii="Arial" w:hAnsi="Arial"/>
-          <w:b/>
-          <w:bCs/>
-          <w:sz w:val="21"/>
-          <w:szCs w:val="21"/>
-          <w:lang w:val="pt-BR"/>
+        </w:rPr>
+      </w:pPr>
+      <w:r>
+        <w:rPr>
+          <w:rFonts w:ascii="Arial" w:hAnsi="Arial"/>
+          <w:b/>
+          <w:bCs/>
+          <w:sz w:val="21"/>
+          <w:szCs w:val="21"/>
         </w:rPr>
         <w:t>First(DECLARACAORETORNO)</w:t>
       </w:r>
@@ -1708,7 +1820,6 @@
           <w:rFonts w:ascii="Arial" w:hAnsi="Arial"/>
           <w:sz w:val="21"/>
           <w:szCs w:val="21"/>
-          <w:lang w:val="pt-BR"/>
         </w:rPr>
         <w:t xml:space="preserve"> = { "return" }</w:t>
       </w:r>
@@ -1721,17 +1832,15 @@
           <w:bCs/>
           <w:sz w:val="21"/>
           <w:szCs w:val="21"/>
-          <w:lang w:val="pt-BR"/>
-        </w:rPr>
-      </w:pPr>
-      <w:r>
-        <w:rPr>
-          <w:rFonts w:ascii="Arial" w:hAnsi="Arial"/>
-          <w:b/>
-          <w:bCs/>
-          <w:sz w:val="21"/>
-          <w:szCs w:val="21"/>
-          <w:lang w:val="pt-BR"/>
+        </w:rPr>
+      </w:pPr>
+      <w:r>
+        <w:rPr>
+          <w:rFonts w:ascii="Arial" w:hAnsi="Arial"/>
+          <w:b/>
+          <w:bCs/>
+          <w:sz w:val="21"/>
+          <w:szCs w:val="21"/>
         </w:rPr>
         <w:t>First(</w:t>
       </w:r>
@@ -1752,7 +1861,6 @@
           <w:bCs/>
           <w:sz w:val="21"/>
           <w:szCs w:val="21"/>
-          <w:lang w:val="pt-BR"/>
         </w:rPr>
         <w:t xml:space="preserve">) </w:t>
       </w:r>
@@ -1761,7 +1869,6 @@
           <w:rFonts w:ascii="Arial" w:hAnsi="Arial"/>
           <w:sz w:val="21"/>
           <w:szCs w:val="21"/>
-          <w:lang w:val="pt-BR"/>
         </w:rPr>
         <w:t>= { "a", ..., "z", "A", ..., "Z" }</w:t>
       </w:r>
@@ -1883,6 +1990,7 @@
           <w:bCs/>
           <w:sz w:val="21"/>
           <w:szCs w:val="21"/>
+          <w:lang w:val="pt-BR"/>
         </w:rPr>
         <w:t>TERMOLOGICO</w:t>
       </w:r>
@@ -2497,7 +2605,6 @@
           <w:bCs/>
           <w:sz w:val="21"/>
           <w:szCs w:val="21"/>
-          <w:lang w:val="pt-BR"/>
         </w:rPr>
         <w:t>$</w:t>
       </w:r>
@@ -2552,7 +2659,6 @@
           <w:rFonts w:ascii="Arial" w:hAnsi="Arial"/>
           <w:sz w:val="21"/>
           <w:szCs w:val="21"/>
-          <w:lang w:val="pt-BR"/>
         </w:rPr>
         <w:t xml:space="preserve"> </w:t>
       </w:r>
@@ -2682,7 +2788,6 @@
           <w:rFonts w:ascii="Arial" w:hAnsi="Arial"/>
           <w:sz w:val="21"/>
           <w:szCs w:val="21"/>
-          <w:lang w:val="pt-BR"/>
         </w:rPr>
         <w:t xml:space="preserve"> </w:t>
       </w:r>
@@ -2776,7 +2881,6 @@
           <w:bCs/>
           <w:sz w:val="21"/>
           <w:szCs w:val="21"/>
-          <w:lang w:val="pt-BR"/>
         </w:rPr>
         <w:t>EXPRESSAOLOGICA</w:t>
       </w:r>
@@ -2853,7 +2957,6 @@
           <w:bCs/>
           <w:sz w:val="21"/>
           <w:szCs w:val="21"/>
-          <w:lang w:val="pt-BR"/>
         </w:rPr>
         <w:t>EXPRESSAORELACIONAL</w:t>
       </w:r>
@@ -3126,198 +3229,333 @@
     <w:sectPr>
       <w:pgSz w:w="11906" w:h="16838"/>
       <w:pgMar w:top="1440" w:right="1800" w:bottom="1440" w:left="1800" w:header="720" w:footer="720" w:gutter="0"/>
-      <w:cols w:space="720" w:num="1"/>
-      <w:docGrid w:linePitch="360" w:charSpace="0"/>
+      <w:cols w:space="720"/>
+      <w:docGrid w:linePitch="360"/>
     </w:sectPr>
   </w:body>
 </w:document>
 </file>
 
 <file path=word/styles.xml><?xml version="1.0" encoding="utf-8"?>
-<w:styles xmlns:mc="http://schemas.openxmlformats.org/markup-compatibility/2006" xmlns:o="urn:schemas-microsoft-com:office:office" xmlns:r="http://schemas.openxmlformats.org/officeDocument/2006/relationships" xmlns:m="http://schemas.openxmlformats.org/officeDocument/2006/math" xmlns:v="urn:schemas-microsoft-com:vml" xmlns:w="http://schemas.openxmlformats.org/wordprocessingml/2006/main" xmlns:w14="http://schemas.microsoft.com/office/word/2010/wordml" xmlns:w10="urn:schemas-microsoft-com:office:word" xmlns:sl="http://schemas.openxmlformats.org/schemaLibrary/2006/main" xmlns:wpsCustomData="http://www.wps.cn/officeDocument/2013/wpsCustomData" mc:Ignorable="w14">
+<w:styles xmlns:mc="http://schemas.openxmlformats.org/markup-compatibility/2006" xmlns:r="http://schemas.openxmlformats.org/officeDocument/2006/relationships" xmlns:w="http://schemas.openxmlformats.org/wordprocessingml/2006/main" xmlns:w14="http://schemas.microsoft.com/office/word/2010/wordml" xmlns:w15="http://schemas.microsoft.com/office/word/2012/wordml" xmlns:w16cex="http://schemas.microsoft.com/office/word/2018/wordml/cex" xmlns:w16cid="http://schemas.microsoft.com/office/word/2016/wordml/cid" xmlns:w16="http://schemas.microsoft.com/office/word/2018/wordml" xmlns:w16du="http://schemas.microsoft.com/office/word/2023/wordml/word16du" xmlns:w16sdtdh="http://schemas.microsoft.com/office/word/2020/wordml/sdtdatahash" xmlns:w16sdtfl="http://schemas.microsoft.com/office/word/2024/wordml/sdtformatlock" xmlns:w16se="http://schemas.microsoft.com/office/word/2015/wordml/symex" mc:Ignorable="w14 w15 w16se w16cid w16 w16cex w16sdtdh w16sdtfl w16du">
   <w:docDefaults>
     <w:rPrDefault>
       <w:rPr>
-        <w:rFonts w:ascii="Times New Roman" w:hAnsi="Times New Roman" w:eastAsia="SimSun" w:cs="Times New Roman"/>
+        <w:rFonts w:ascii="Times New Roman" w:eastAsia="SimSun" w:hAnsi="Times New Roman" w:cs="Times New Roman"/>
+        <w:lang w:val="pt-BR" w:eastAsia="pt-BR" w:bidi="ar-SA"/>
       </w:rPr>
     </w:rPrDefault>
     <w:pPrDefault/>
   </w:docDefaults>
-  <w:latentStyles w:count="260" w:defQFormat="0" w:defUnhideWhenUsed="1" w:defSemiHidden="1" w:defUIPriority="99" w:defLockedState="0">
-    <w:lsdException w:qFormat="1" w:unhideWhenUsed="0" w:uiPriority="0" w:semiHidden="0" w:name="Normal"/>
-    <w:lsdException w:qFormat="1" w:unhideWhenUsed="0" w:uiPriority="0" w:semiHidden="0" w:name="heading 1"/>
-    <w:lsdException w:qFormat="1" w:uiPriority="0" w:name="heading 2"/>
-    <w:lsdException w:qFormat="1" w:uiPriority="0" w:name="heading 3"/>
-    <w:lsdException w:qFormat="1" w:uiPriority="0" w:name="heading 4"/>
-    <w:lsdException w:qFormat="1" w:uiPriority="0" w:name="heading 5"/>
-    <w:lsdException w:qFormat="1" w:uiPriority="0" w:name="heading 6"/>
-    <w:lsdException w:qFormat="1" w:uiPriority="0" w:name="heading 7"/>
-    <w:lsdException w:qFormat="1" w:uiPriority="0" w:name="heading 8"/>
-    <w:lsdException w:qFormat="1" w:uiPriority="0" w:name="heading 9"/>
-    <w:lsdException w:unhideWhenUsed="0" w:uiPriority="0" w:semiHidden="0" w:name="index 1"/>
-    <w:lsdException w:unhideWhenUsed="0" w:uiPriority="0" w:semiHidden="0" w:name="index 2"/>
-    <w:lsdException w:unhideWhenUsed="0" w:uiPriority="0" w:semiHidden="0" w:name="index 3"/>
-    <w:lsdException w:unhideWhenUsed="0" w:uiPriority="0" w:semiHidden="0" w:name="index 4"/>
-    <w:lsdException w:unhideWhenUsed="0" w:uiPriority="0" w:semiHidden="0" w:name="index 5"/>
-    <w:lsdException w:unhideWhenUsed="0" w:uiPriority="0" w:semiHidden="0" w:name="index 6"/>
-    <w:lsdException w:unhideWhenUsed="0" w:uiPriority="0" w:semiHidden="0" w:name="index 7"/>
-    <w:lsdException w:unhideWhenUsed="0" w:uiPriority="0" w:semiHidden="0" w:name="index 8"/>
-    <w:lsdException w:unhideWhenUsed="0" w:uiPriority="0" w:semiHidden="0" w:name="index 9"/>
-    <w:lsdException w:unhideWhenUsed="0" w:uiPriority="0" w:semiHidden="0" w:name="toc 1"/>
-    <w:lsdException w:unhideWhenUsed="0" w:uiPriority="0" w:semiHidden="0" w:name="toc 2"/>
-    <w:lsdException w:unhideWhenUsed="0" w:uiPriority="0" w:semiHidden="0" w:name="toc 3"/>
-    <w:lsdException w:unhideWhenUsed="0" w:uiPriority="0" w:semiHidden="0" w:name="toc 4"/>
-    <w:lsdException w:unhideWhenUsed="0" w:uiPriority="0" w:semiHidden="0" w:name="toc 5"/>
-    <w:lsdException w:unhideWhenUsed="0" w:uiPriority="0" w:semiHidden="0" w:name="toc 6"/>
-    <w:lsdException w:unhideWhenUsed="0" w:uiPriority="0" w:semiHidden="0" w:name="toc 7"/>
-    <w:lsdException w:unhideWhenUsed="0" w:uiPriority="0" w:semiHidden="0" w:name="toc 8"/>
-    <w:lsdException w:unhideWhenUsed="0" w:uiPriority="0" w:semiHidden="0" w:name="toc 9"/>
-    <w:lsdException w:unhideWhenUsed="0" w:uiPriority="0" w:semiHidden="0" w:name="Normal Indent"/>
-    <w:lsdException w:unhideWhenUsed="0" w:uiPriority="0" w:semiHidden="0" w:name="footnote text"/>
-    <w:lsdException w:unhideWhenUsed="0" w:uiPriority="0" w:semiHidden="0" w:name="annotation text"/>
-    <w:lsdException w:unhideWhenUsed="0" w:uiPriority="0" w:semiHidden="0" w:name="header"/>
-    <w:lsdException w:unhideWhenUsed="0" w:uiPriority="0" w:semiHidden="0" w:name="footer"/>
-    <w:lsdException w:unhideWhenUsed="0" w:uiPriority="0" w:semiHidden="0" w:name="index heading"/>
-    <w:lsdException w:qFormat="1" w:uiPriority="0" w:name="caption"/>
-    <w:lsdException w:unhideWhenUsed="0" w:uiPriority="0" w:semiHidden="0" w:name="table of figures"/>
-    <w:lsdException w:unhideWhenUsed="0" w:uiPriority="0" w:semiHidden="0" w:name="envelope address"/>
-    <w:lsdException w:unhideWhenUsed="0" w:uiPriority="0" w:semiHidden="0" w:name="envelope return"/>
-    <w:lsdException w:unhideWhenUsed="0" w:uiPriority="0" w:semiHidden="0" w:name="footnote reference"/>
-    <w:lsdException w:unhideWhenUsed="0" w:uiPriority="0" w:semiHidden="0" w:name="annotation reference"/>
-    <w:lsdException w:unhideWhenUsed="0" w:uiPriority="0" w:semiHidden="0" w:name="line number"/>
-    <w:lsdException w:unhideWhenUsed="0" w:uiPriority="0" w:semiHidden="0" w:name="page number"/>
-    <w:lsdException w:unhideWhenUsed="0" w:uiPriority="0" w:semiHidden="0" w:name="endnote reference"/>
-    <w:lsdException w:unhideWhenUsed="0" w:uiPriority="0" w:semiHidden="0" w:name="endnote text"/>
-    <w:lsdException w:unhideWhenUsed="0" w:uiPriority="0" w:semiHidden="0" w:name="table of authorities"/>
-    <w:lsdException w:unhideWhenUsed="0" w:uiPriority="0" w:semiHidden="0" w:name="macro"/>
-    <w:lsdException w:unhideWhenUsed="0" w:uiPriority="0" w:semiHidden="0" w:name="toa heading"/>
-    <w:lsdException w:unhideWhenUsed="0" w:uiPriority="0" w:semiHidden="0" w:name="List"/>
-    <w:lsdException w:unhideWhenUsed="0" w:uiPriority="0" w:semiHidden="0" w:name="List Bullet"/>
-    <w:lsdException w:unhideWhenUsed="0" w:uiPriority="0" w:semiHidden="0" w:name="List Number"/>
-    <w:lsdException w:unhideWhenUsed="0" w:uiPriority="0" w:semiHidden="0" w:name="List 2"/>
-    <w:lsdException w:unhideWhenUsed="0" w:uiPriority="0" w:semiHidden="0" w:name="List 3"/>
-    <w:lsdException w:unhideWhenUsed="0" w:uiPriority="0" w:semiHidden="0" w:name="List 4"/>
-    <w:lsdException w:unhideWhenUsed="0" w:uiPriority="0" w:semiHidden="0" w:name="List 5"/>
-    <w:lsdException w:unhideWhenUsed="0" w:uiPriority="0" w:semiHidden="0" w:name="List Bullet 2"/>
-    <w:lsdException w:unhideWhenUsed="0" w:uiPriority="0" w:semiHidden="0" w:name="List Bullet 3"/>
-    <w:lsdException w:unhideWhenUsed="0" w:uiPriority="0" w:semiHidden="0" w:name="List Bullet 4"/>
-    <w:lsdException w:unhideWhenUsed="0" w:uiPriority="0" w:semiHidden="0" w:name="List Bullet 5"/>
-    <w:lsdException w:unhideWhenUsed="0" w:uiPriority="0" w:semiHidden="0" w:name="List Number 2"/>
-    <w:lsdException w:unhideWhenUsed="0" w:uiPriority="0" w:semiHidden="0" w:name="List Number 3"/>
-    <w:lsdException w:unhideWhenUsed="0" w:uiPriority="0" w:semiHidden="0" w:name="List Number 4"/>
-    <w:lsdException w:unhideWhenUsed="0" w:uiPriority="0" w:semiHidden="0" w:name="List Number 5"/>
-    <w:lsdException w:qFormat="1" w:unhideWhenUsed="0" w:uiPriority="0" w:semiHidden="0" w:name="Title"/>
-    <w:lsdException w:unhideWhenUsed="0" w:uiPriority="0" w:semiHidden="0" w:name="Closing"/>
-    <w:lsdException w:unhideWhenUsed="0" w:uiPriority="0" w:semiHidden="0" w:name="Signature"/>
-    <w:lsdException w:qFormat="1" w:uiPriority="1" w:name="Default Paragraph Font"/>
-    <w:lsdException w:unhideWhenUsed="0" w:uiPriority="0" w:semiHidden="0" w:name="Body Text"/>
-    <w:lsdException w:unhideWhenUsed="0" w:uiPriority="0" w:semiHidden="0" w:name="Body Text Indent"/>
-    <w:lsdException w:unhideWhenUsed="0" w:uiPriority="0" w:semiHidden="0" w:name="List Continue"/>
-    <w:lsdException w:unhideWhenUsed="0" w:uiPriority="0" w:semiHidden="0" w:name="List Continue 2"/>
-    <w:lsdException w:unhideWhenUsed="0" w:uiPriority="0" w:semiHidden="0" w:name="List Continue 3"/>
-    <w:lsdException w:unhideWhenUsed="0" w:uiPriority="0" w:semiHidden="0" w:name="List Continue 4"/>
-    <w:lsdException w:unhideWhenUsed="0" w:uiPriority="0" w:semiHidden="0" w:name="List Continue 5"/>
-    <w:lsdException w:unhideWhenUsed="0" w:uiPriority="0" w:semiHidden="0" w:name="Message Header"/>
-    <w:lsdException w:qFormat="1" w:unhideWhenUsed="0" w:uiPriority="0" w:semiHidden="0" w:name="Subtitle"/>
-    <w:lsdException w:unhideWhenUsed="0" w:uiPriority="0" w:semiHidden="0" w:name="Salutation"/>
-    <w:lsdException w:unhideWhenUsed="0" w:uiPriority="0" w:semiHidden="0" w:name="Date"/>
-    <w:lsdException w:unhideWhenUsed="0" w:uiPriority="0" w:semiHidden="0" w:name="Body Text First Indent"/>
-    <w:lsdException w:unhideWhenUsed="0" w:uiPriority="0" w:semiHidden="0" w:name="Body Text First Indent 2"/>
-    <w:lsdException w:unhideWhenUsed="0" w:uiPriority="0" w:semiHidden="0" w:name="Note Heading"/>
-    <w:lsdException w:unhideWhenUsed="0" w:uiPriority="0" w:semiHidden="0" w:name="Body Text 2"/>
-    <w:lsdException w:unhideWhenUsed="0" w:uiPriority="0" w:semiHidden="0" w:name="Body Text 3"/>
-    <w:lsdException w:unhideWhenUsed="0" w:uiPriority="0" w:semiHidden="0" w:name="Body Text Indent 2"/>
-    <w:lsdException w:unhideWhenUsed="0" w:uiPriority="0" w:semiHidden="0" w:name="Body Text Indent 3"/>
-    <w:lsdException w:unhideWhenUsed="0" w:uiPriority="0" w:semiHidden="0" w:name="Block Text"/>
-    <w:lsdException w:unhideWhenUsed="0" w:uiPriority="0" w:semiHidden="0" w:name="Hyperlink"/>
-    <w:lsdException w:unhideWhenUsed="0" w:uiPriority="0" w:semiHidden="0" w:name="FollowedHyperlink"/>
-    <w:lsdException w:qFormat="1" w:unhideWhenUsed="0" w:uiPriority="0" w:semiHidden="0" w:name="Strong"/>
-    <w:lsdException w:qFormat="1" w:unhideWhenUsed="0" w:uiPriority="0" w:semiHidden="0" w:name="Emphasis"/>
-    <w:lsdException w:unhideWhenUsed="0" w:uiPriority="0" w:semiHidden="0" w:name="Document Map"/>
-    <w:lsdException w:unhideWhenUsed="0" w:uiPriority="0" w:semiHidden="0" w:name="Plain Text"/>
-    <w:lsdException w:unhideWhenUsed="0" w:uiPriority="0" w:semiHidden="0" w:name="E-mail Signature"/>
-    <w:lsdException w:unhideWhenUsed="0" w:uiPriority="0" w:semiHidden="0" w:name="Normal (Web)"/>
-    <w:lsdException w:unhideWhenUsed="0" w:uiPriority="0" w:semiHidden="0" w:name="HTML Acronym"/>
-    <w:lsdException w:unhideWhenUsed="0" w:uiPriority="0" w:semiHidden="0" w:name="HTML Address"/>
-    <w:lsdException w:unhideWhenUsed="0" w:uiPriority="0" w:semiHidden="0" w:name="HTML Cite"/>
-    <w:lsdException w:unhideWhenUsed="0" w:uiPriority="0" w:semiHidden="0" w:name="HTML Code"/>
-    <w:lsdException w:unhideWhenUsed="0" w:uiPriority="0" w:semiHidden="0" w:name="HTML Definition"/>
-    <w:lsdException w:unhideWhenUsed="0" w:uiPriority="0" w:semiHidden="0" w:name="HTML Keyboard"/>
-    <w:lsdException w:unhideWhenUsed="0" w:uiPriority="0" w:semiHidden="0" w:name="HTML Preformatted"/>
-    <w:lsdException w:unhideWhenUsed="0" w:uiPriority="0" w:semiHidden="0" w:name="HTML Sample"/>
-    <w:lsdException w:unhideWhenUsed="0" w:uiPriority="0" w:semiHidden="0" w:name="HTML Typewriter"/>
-    <w:lsdException w:unhideWhenUsed="0" w:uiPriority="0" w:semiHidden="0" w:name="HTML Variable"/>
-    <w:lsdException w:qFormat="1" w:uiPriority="99" w:name="Normal Table"/>
-    <w:lsdException w:unhideWhenUsed="0" w:uiPriority="0" w:semiHidden="0" w:name="annotation subject"/>
-    <w:lsdException w:uiPriority="0" w:name="Table Simple 1"/>
-    <w:lsdException w:uiPriority="0" w:name="Table Simple 2"/>
-    <w:lsdException w:uiPriority="0" w:name="Table Simple 3"/>
-    <w:lsdException w:uiPriority="0" w:name="Table Classic 1"/>
-    <w:lsdException w:uiPriority="0" w:name="Table Classic 2"/>
-    <w:lsdException w:uiPriority="0" w:name="Table Classic 3"/>
-    <w:lsdException w:uiPriority="0" w:name="Table Classic 4"/>
-    <w:lsdException w:uiPriority="0" w:name="Table Colorful 1"/>
-    <w:lsdException w:uiPriority="0" w:name="Table Colorful 2"/>
-    <w:lsdException w:uiPriority="0" w:name="Table Colorful 3"/>
-    <w:lsdException w:uiPriority="0" w:name="Table Columns 1"/>
-    <w:lsdException w:uiPriority="0" w:name="Table Columns 2"/>
-    <w:lsdException w:uiPriority="0" w:name="Table Columns 3"/>
-    <w:lsdException w:uiPriority="0" w:name="Table Columns 4"/>
-    <w:lsdException w:uiPriority="0" w:name="Table Columns 5"/>
-    <w:lsdException w:uiPriority="0" w:name="Table Grid 1"/>
-    <w:lsdException w:uiPriority="0" w:name="Table Grid 2"/>
-    <w:lsdException w:uiPriority="0" w:name="Table Grid 3"/>
-    <w:lsdException w:uiPriority="0" w:name="Table Grid 4"/>
-    <w:lsdException w:uiPriority="0" w:name="Table Grid 5"/>
-    <w:lsdException w:uiPriority="0" w:name="Table Grid 6"/>
-    <w:lsdException w:uiPriority="0" w:name="Table Grid 7"/>
-    <w:lsdException w:uiPriority="0" w:name="Table Grid 8"/>
-    <w:lsdException w:uiPriority="0" w:name="Table List 1"/>
-    <w:lsdException w:uiPriority="0" w:name="Table List 2"/>
-    <w:lsdException w:uiPriority="0" w:name="Table List 3"/>
-    <w:lsdException w:uiPriority="0" w:name="Table List 4"/>
-    <w:lsdException w:uiPriority="0" w:name="Table List 5"/>
-    <w:lsdException w:uiPriority="0" w:name="Table List 6"/>
-    <w:lsdException w:uiPriority="0" w:name="Table List 7"/>
-    <w:lsdException w:uiPriority="0" w:name="Table List 8"/>
-    <w:lsdException w:uiPriority="0" w:name="Table 3D effects 1"/>
-    <w:lsdException w:uiPriority="0" w:name="Table 3D effects 2"/>
-    <w:lsdException w:uiPriority="0" w:name="Table 3D effects 3"/>
-    <w:lsdException w:uiPriority="0" w:name="Table Contemporary"/>
-    <w:lsdException w:uiPriority="0" w:name="Table Elegant"/>
-    <w:lsdException w:uiPriority="0" w:name="Table Professional"/>
-    <w:lsdException w:uiPriority="0" w:name="Table Subtle 1"/>
-    <w:lsdException w:uiPriority="0" w:name="Table Subtle 2"/>
-    <w:lsdException w:uiPriority="0" w:name="Table Web 1"/>
-    <w:lsdException w:uiPriority="0" w:name="Table Web 2"/>
-    <w:lsdException w:uiPriority="0" w:name="Table Web 3"/>
-    <w:lsdException w:unhideWhenUsed="0" w:uiPriority="0" w:semiHidden="0" w:name="Balloon Text"/>
-    <w:lsdException w:uiPriority="0" w:name="Table Grid"/>
-    <w:lsdException w:uiPriority="0" w:name="Table Theme"/>
+  <w:latentStyles w:defLockedState="0" w:defUIPriority="0" w:defSemiHidden="0" w:defUnhideWhenUsed="0" w:defQFormat="0" w:count="376">
+    <w:lsdException w:name="Normal" w:qFormat="1"/>
+    <w:lsdException w:name="heading 1" w:qFormat="1"/>
+    <w:lsdException w:name="heading 2" w:semiHidden="1" w:unhideWhenUsed="1" w:qFormat="1"/>
+    <w:lsdException w:name="heading 3" w:semiHidden="1" w:unhideWhenUsed="1" w:qFormat="1"/>
+    <w:lsdException w:name="heading 4" w:semiHidden="1" w:unhideWhenUsed="1" w:qFormat="1"/>
+    <w:lsdException w:name="heading 5" w:semiHidden="1" w:unhideWhenUsed="1" w:qFormat="1"/>
+    <w:lsdException w:name="heading 6" w:semiHidden="1" w:unhideWhenUsed="1" w:qFormat="1"/>
+    <w:lsdException w:name="heading 7" w:semiHidden="1" w:unhideWhenUsed="1" w:qFormat="1"/>
+    <w:lsdException w:name="heading 8" w:semiHidden="1" w:unhideWhenUsed="1" w:qFormat="1"/>
+    <w:lsdException w:name="heading 9" w:semiHidden="1" w:unhideWhenUsed="1" w:qFormat="1"/>
+    <w:lsdException w:name="caption" w:semiHidden="1" w:unhideWhenUsed="1" w:qFormat="1"/>
+    <w:lsdException w:name="Title" w:qFormat="1"/>
+    <w:lsdException w:name="Default Paragraph Font" w:semiHidden="1" w:uiPriority="1" w:unhideWhenUsed="1" w:qFormat="1"/>
+    <w:lsdException w:name="Subtitle" w:qFormat="1"/>
+    <w:lsdException w:name="Strong" w:qFormat="1"/>
+    <w:lsdException w:name="Emphasis" w:qFormat="1"/>
+    <w:lsdException w:name="HTML Top of Form" w:semiHidden="1" w:uiPriority="99" w:unhideWhenUsed="1"/>
+    <w:lsdException w:name="HTML Bottom of Form" w:semiHidden="1" w:uiPriority="99" w:unhideWhenUsed="1"/>
+    <w:lsdException w:name="Normal Table" w:semiHidden="1" w:uiPriority="99" w:unhideWhenUsed="1" w:qFormat="1"/>
+    <w:lsdException w:name="No List" w:semiHidden="1" w:uiPriority="99" w:unhideWhenUsed="1"/>
+    <w:lsdException w:name="Outline List 1" w:semiHidden="1" w:uiPriority="99" w:unhideWhenUsed="1"/>
+    <w:lsdException w:name="Outline List 2" w:semiHidden="1" w:uiPriority="99" w:unhideWhenUsed="1"/>
+    <w:lsdException w:name="Outline List 3" w:semiHidden="1" w:uiPriority="99" w:unhideWhenUsed="1"/>
+    <w:lsdException w:name="Table Simple 1" w:semiHidden="1" w:unhideWhenUsed="1"/>
+    <w:lsdException w:name="Table Simple 2" w:semiHidden="1" w:unhideWhenUsed="1"/>
+    <w:lsdException w:name="Table Simple 3" w:semiHidden="1" w:unhideWhenUsed="1"/>
+    <w:lsdException w:name="Table Classic 1" w:semiHidden="1" w:unhideWhenUsed="1"/>
+    <w:lsdException w:name="Table Classic 2" w:semiHidden="1" w:unhideWhenUsed="1"/>
+    <w:lsdException w:name="Table Classic 3" w:semiHidden="1" w:unhideWhenUsed="1"/>
+    <w:lsdException w:name="Table Classic 4" w:semiHidden="1" w:unhideWhenUsed="1"/>
+    <w:lsdException w:name="Table Colorful 1" w:semiHidden="1" w:unhideWhenUsed="1"/>
+    <w:lsdException w:name="Table Colorful 2" w:semiHidden="1" w:unhideWhenUsed="1"/>
+    <w:lsdException w:name="Table Colorful 3" w:semiHidden="1" w:unhideWhenUsed="1"/>
+    <w:lsdException w:name="Table Columns 1" w:semiHidden="1" w:unhideWhenUsed="1"/>
+    <w:lsdException w:name="Table Columns 2" w:semiHidden="1" w:unhideWhenUsed="1"/>
+    <w:lsdException w:name="Table Columns 3" w:semiHidden="1" w:unhideWhenUsed="1"/>
+    <w:lsdException w:name="Table Columns 4" w:semiHidden="1" w:unhideWhenUsed="1"/>
+    <w:lsdException w:name="Table Columns 5" w:semiHidden="1" w:unhideWhenUsed="1"/>
+    <w:lsdException w:name="Table Grid 1" w:semiHidden="1" w:unhideWhenUsed="1"/>
+    <w:lsdException w:name="Table Grid 2" w:semiHidden="1" w:unhideWhenUsed="1"/>
+    <w:lsdException w:name="Table Grid 3" w:semiHidden="1" w:unhideWhenUsed="1"/>
+    <w:lsdException w:name="Table Grid 4" w:semiHidden="1" w:unhideWhenUsed="1"/>
+    <w:lsdException w:name="Table Grid 5" w:semiHidden="1" w:unhideWhenUsed="1"/>
+    <w:lsdException w:name="Table Grid 6" w:semiHidden="1" w:unhideWhenUsed="1"/>
+    <w:lsdException w:name="Table Grid 7" w:semiHidden="1" w:unhideWhenUsed="1"/>
+    <w:lsdException w:name="Table Grid 8" w:semiHidden="1" w:unhideWhenUsed="1"/>
+    <w:lsdException w:name="Table List 1" w:semiHidden="1" w:unhideWhenUsed="1"/>
+    <w:lsdException w:name="Table List 2" w:semiHidden="1" w:unhideWhenUsed="1"/>
+    <w:lsdException w:name="Table List 3" w:semiHidden="1" w:unhideWhenUsed="1"/>
+    <w:lsdException w:name="Table List 4" w:semiHidden="1" w:unhideWhenUsed="1"/>
+    <w:lsdException w:name="Table List 5" w:semiHidden="1" w:unhideWhenUsed="1"/>
+    <w:lsdException w:name="Table List 6" w:semiHidden="1" w:unhideWhenUsed="1"/>
+    <w:lsdException w:name="Table List 7" w:semiHidden="1" w:unhideWhenUsed="1"/>
+    <w:lsdException w:name="Table List 8" w:semiHidden="1" w:unhideWhenUsed="1"/>
+    <w:lsdException w:name="Table 3D effects 1" w:semiHidden="1" w:unhideWhenUsed="1"/>
+    <w:lsdException w:name="Table 3D effects 2" w:semiHidden="1" w:unhideWhenUsed="1"/>
+    <w:lsdException w:name="Table 3D effects 3" w:semiHidden="1" w:unhideWhenUsed="1"/>
+    <w:lsdException w:name="Table Contemporary" w:semiHidden="1" w:unhideWhenUsed="1"/>
+    <w:lsdException w:name="Table Elegant" w:semiHidden="1" w:unhideWhenUsed="1"/>
+    <w:lsdException w:name="Table Professional" w:semiHidden="1" w:unhideWhenUsed="1"/>
+    <w:lsdException w:name="Table Subtle 1" w:semiHidden="1" w:unhideWhenUsed="1"/>
+    <w:lsdException w:name="Table Subtle 2" w:semiHidden="1" w:unhideWhenUsed="1"/>
+    <w:lsdException w:name="Table Web 1" w:semiHidden="1" w:unhideWhenUsed="1"/>
+    <w:lsdException w:name="Table Web 2" w:semiHidden="1" w:unhideWhenUsed="1"/>
+    <w:lsdException w:name="Table Web 3" w:semiHidden="1" w:unhideWhenUsed="1"/>
+    <w:lsdException w:name="Table Theme" w:semiHidden="1" w:unhideWhenUsed="1"/>
+    <w:lsdException w:name="Placeholder Text" w:semiHidden="1" w:uiPriority="99" w:unhideWhenUsed="1"/>
+    <w:lsdException w:name="No Spacing" w:semiHidden="1" w:uiPriority="99" w:unhideWhenUsed="1"/>
+    <w:lsdException w:name="Light Shading" w:uiPriority="99"/>
+    <w:lsdException w:name="Light List" w:uiPriority="99"/>
+    <w:lsdException w:name="Light Grid" w:uiPriority="99"/>
+    <w:lsdException w:name="Medium Shading 1" w:uiPriority="99"/>
+    <w:lsdException w:name="Medium Shading 2" w:uiPriority="99"/>
+    <w:lsdException w:name="Medium List 1" w:uiPriority="99"/>
+    <w:lsdException w:name="Medium List 2" w:uiPriority="99"/>
+    <w:lsdException w:name="Medium Grid 1" w:uiPriority="99"/>
+    <w:lsdException w:name="Medium Grid 2" w:uiPriority="99"/>
+    <w:lsdException w:name="Medium Grid 3" w:uiPriority="99"/>
+    <w:lsdException w:name="Dark List" w:uiPriority="99"/>
+    <w:lsdException w:name="Colorful Shading" w:uiPriority="99"/>
+    <w:lsdException w:name="Colorful List" w:uiPriority="99"/>
+    <w:lsdException w:name="Colorful Grid" w:uiPriority="99"/>
+    <w:lsdException w:name="Light Shading Accent 1" w:uiPriority="99"/>
+    <w:lsdException w:name="Light List Accent 1" w:uiPriority="99"/>
+    <w:lsdException w:name="Light Grid Accent 1" w:uiPriority="99"/>
+    <w:lsdException w:name="Medium Shading 1 Accent 1" w:uiPriority="99"/>
+    <w:lsdException w:name="Medium Shading 2 Accent 1" w:uiPriority="99"/>
+    <w:lsdException w:name="Medium List 1 Accent 1" w:uiPriority="99"/>
+    <w:lsdException w:name="Revision" w:semiHidden="1" w:uiPriority="99" w:unhideWhenUsed="1"/>
+    <w:lsdException w:name="List Paragraph" w:semiHidden="1" w:uiPriority="99" w:unhideWhenUsed="1"/>
+    <w:lsdException w:name="Quote" w:semiHidden="1" w:uiPriority="99" w:unhideWhenUsed="1"/>
+    <w:lsdException w:name="Intense Quote" w:semiHidden="1" w:uiPriority="99" w:unhideWhenUsed="1"/>
+    <w:lsdException w:name="Medium List 2 Accent 1" w:uiPriority="99"/>
+    <w:lsdException w:name="Medium Grid 1 Accent 1" w:uiPriority="99"/>
+    <w:lsdException w:name="Medium Grid 2 Accent 1" w:uiPriority="99"/>
+    <w:lsdException w:name="Medium Grid 3 Accent 1" w:uiPriority="99"/>
+    <w:lsdException w:name="Dark List Accent 1" w:uiPriority="99"/>
+    <w:lsdException w:name="Colorful Shading Accent 1" w:uiPriority="99"/>
+    <w:lsdException w:name="Colorful List Accent 1" w:uiPriority="99"/>
+    <w:lsdException w:name="Colorful Grid Accent 1" w:uiPriority="99"/>
+    <w:lsdException w:name="Light Shading Accent 2" w:uiPriority="99"/>
+    <w:lsdException w:name="Light List Accent 2" w:uiPriority="99"/>
+    <w:lsdException w:name="Light Grid Accent 2" w:uiPriority="99"/>
+    <w:lsdException w:name="Medium Shading 1 Accent 2" w:uiPriority="99"/>
+    <w:lsdException w:name="Medium Shading 2 Accent 2" w:uiPriority="99"/>
+    <w:lsdException w:name="Medium List 1 Accent 2" w:uiPriority="99"/>
+    <w:lsdException w:name="Medium List 2 Accent 2" w:uiPriority="99"/>
+    <w:lsdException w:name="Medium Grid 1 Accent 2" w:uiPriority="99"/>
+    <w:lsdException w:name="Medium Grid 2 Accent 2" w:uiPriority="99"/>
+    <w:lsdException w:name="Medium Grid 3 Accent 2" w:uiPriority="99"/>
+    <w:lsdException w:name="Dark List Accent 2" w:uiPriority="99"/>
+    <w:lsdException w:name="Colorful Shading Accent 2" w:uiPriority="99"/>
+    <w:lsdException w:name="Colorful List Accent 2" w:uiPriority="99"/>
+    <w:lsdException w:name="Colorful Grid Accent 2" w:uiPriority="99"/>
+    <w:lsdException w:name="Light Shading Accent 3" w:uiPriority="99"/>
+    <w:lsdException w:name="Light List Accent 3" w:uiPriority="99"/>
+    <w:lsdException w:name="Light Grid Accent 3" w:uiPriority="99"/>
+    <w:lsdException w:name="Medium Shading 1 Accent 3" w:uiPriority="99"/>
+    <w:lsdException w:name="Medium Shading 2 Accent 3" w:uiPriority="99"/>
+    <w:lsdException w:name="Medium List 1 Accent 3" w:uiPriority="99"/>
+    <w:lsdException w:name="Medium List 2 Accent 3" w:uiPriority="99"/>
+    <w:lsdException w:name="Medium Grid 1 Accent 3" w:uiPriority="99"/>
+    <w:lsdException w:name="Medium Grid 2 Accent 3" w:uiPriority="99"/>
+    <w:lsdException w:name="Medium Grid 3 Accent 3" w:uiPriority="99"/>
+    <w:lsdException w:name="Dark List Accent 3" w:uiPriority="99"/>
+    <w:lsdException w:name="Colorful Shading Accent 3" w:uiPriority="99"/>
+    <w:lsdException w:name="Colorful List Accent 3" w:uiPriority="99"/>
+    <w:lsdException w:name="Colorful Grid Accent 3" w:uiPriority="99"/>
+    <w:lsdException w:name="Light Shading Accent 4" w:uiPriority="99"/>
+    <w:lsdException w:name="Light List Accent 4" w:uiPriority="99"/>
+    <w:lsdException w:name="Light Grid Accent 4" w:uiPriority="99"/>
+    <w:lsdException w:name="Medium Shading 1 Accent 4" w:uiPriority="99"/>
+    <w:lsdException w:name="Medium Shading 2 Accent 4" w:uiPriority="99"/>
+    <w:lsdException w:name="Medium List 1 Accent 4" w:uiPriority="99"/>
+    <w:lsdException w:name="Medium List 2 Accent 4" w:uiPriority="99"/>
+    <w:lsdException w:name="Medium Grid 1 Accent 4" w:uiPriority="99"/>
+    <w:lsdException w:name="Medium Grid 2 Accent 4" w:uiPriority="99"/>
+    <w:lsdException w:name="Medium Grid 3 Accent 4" w:uiPriority="99"/>
+    <w:lsdException w:name="Dark List Accent 4" w:uiPriority="99"/>
+    <w:lsdException w:name="Colorful Shading Accent 4" w:uiPriority="99"/>
+    <w:lsdException w:name="Colorful List Accent 4" w:uiPriority="99"/>
+    <w:lsdException w:name="Colorful Grid Accent 4" w:uiPriority="99"/>
+    <w:lsdException w:name="Light Shading Accent 5" w:uiPriority="99"/>
+    <w:lsdException w:name="Light List Accent 5" w:uiPriority="99"/>
+    <w:lsdException w:name="Light Grid Accent 5" w:uiPriority="99"/>
+    <w:lsdException w:name="Medium Shading 1 Accent 5" w:uiPriority="99"/>
+    <w:lsdException w:name="Medium Shading 2 Accent 5" w:uiPriority="99"/>
+    <w:lsdException w:name="Medium List 1 Accent 5" w:uiPriority="99"/>
+    <w:lsdException w:name="Medium List 2 Accent 5" w:uiPriority="99"/>
+    <w:lsdException w:name="Medium Grid 1 Accent 5" w:uiPriority="99"/>
+    <w:lsdException w:name="Medium Grid 2 Accent 5" w:uiPriority="99"/>
+    <w:lsdException w:name="Medium Grid 3 Accent 5" w:uiPriority="99"/>
+    <w:lsdException w:name="Dark List Accent 5" w:uiPriority="99"/>
+    <w:lsdException w:name="Colorful Shading Accent 5" w:uiPriority="99"/>
+    <w:lsdException w:name="Colorful List Accent 5" w:uiPriority="99"/>
+    <w:lsdException w:name="Colorful Grid Accent 5" w:uiPriority="99"/>
+    <w:lsdException w:name="Light Shading Accent 6" w:uiPriority="99"/>
+    <w:lsdException w:name="Light List Accent 6" w:uiPriority="99"/>
+    <w:lsdException w:name="Light Grid Accent 6" w:uiPriority="99"/>
+    <w:lsdException w:name="Medium Shading 1 Accent 6" w:uiPriority="99"/>
+    <w:lsdException w:name="Medium Shading 2 Accent 6" w:uiPriority="99"/>
+    <w:lsdException w:name="Medium List 1 Accent 6" w:uiPriority="99"/>
+    <w:lsdException w:name="Medium List 2 Accent 6" w:uiPriority="99"/>
+    <w:lsdException w:name="Medium Grid 1 Accent 6" w:uiPriority="99"/>
+    <w:lsdException w:name="Medium Grid 2 Accent 6" w:uiPriority="99"/>
+    <w:lsdException w:name="Medium Grid 3 Accent 6" w:uiPriority="99"/>
+    <w:lsdException w:name="Dark List Accent 6" w:uiPriority="99"/>
+    <w:lsdException w:name="Colorful Shading Accent 6" w:uiPriority="99"/>
+    <w:lsdException w:name="Colorful List Accent 6" w:uiPriority="99"/>
+    <w:lsdException w:name="Colorful Grid Accent 6" w:uiPriority="99"/>
+    <w:lsdException w:name="Subtle Emphasis" w:uiPriority="19" w:qFormat="1"/>
+    <w:lsdException w:name="Intense Emphasis" w:uiPriority="21" w:qFormat="1"/>
+    <w:lsdException w:name="Subtle Reference" w:uiPriority="31" w:qFormat="1"/>
+    <w:lsdException w:name="Intense Reference" w:uiPriority="32" w:qFormat="1"/>
+    <w:lsdException w:name="Book Title" w:uiPriority="33" w:qFormat="1"/>
+    <w:lsdException w:name="Bibliography" w:semiHidden="1" w:uiPriority="37" w:unhideWhenUsed="1"/>
+    <w:lsdException w:name="TOC Heading" w:semiHidden="1" w:uiPriority="39" w:unhideWhenUsed="1" w:qFormat="1"/>
+    <w:lsdException w:name="Plain Table 1" w:uiPriority="41"/>
+    <w:lsdException w:name="Plain Table 2" w:uiPriority="42"/>
+    <w:lsdException w:name="Plain Table 3" w:uiPriority="43"/>
+    <w:lsdException w:name="Plain Table 4" w:uiPriority="44"/>
+    <w:lsdException w:name="Plain Table 5" w:uiPriority="45"/>
+    <w:lsdException w:name="Grid Table Light" w:uiPriority="40"/>
+    <w:lsdException w:name="Grid Table 1 Light" w:uiPriority="46"/>
+    <w:lsdException w:name="Grid Table 2" w:uiPriority="47"/>
+    <w:lsdException w:name="Grid Table 3" w:uiPriority="48"/>
+    <w:lsdException w:name="Grid Table 4" w:uiPriority="49"/>
+    <w:lsdException w:name="Grid Table 5 Dark" w:uiPriority="50"/>
+    <w:lsdException w:name="Grid Table 6 Colorful" w:uiPriority="51"/>
+    <w:lsdException w:name="Grid Table 7 Colorful" w:uiPriority="52"/>
+    <w:lsdException w:name="Grid Table 1 Light Accent 1" w:uiPriority="46"/>
+    <w:lsdException w:name="Grid Table 2 Accent 1" w:uiPriority="47"/>
+    <w:lsdException w:name="Grid Table 3 Accent 1" w:uiPriority="48"/>
+    <w:lsdException w:name="Grid Table 4 Accent 1" w:uiPriority="49"/>
+    <w:lsdException w:name="Grid Table 5 Dark Accent 1" w:uiPriority="50"/>
+    <w:lsdException w:name="Grid Table 6 Colorful Accent 1" w:uiPriority="51"/>
+    <w:lsdException w:name="Grid Table 7 Colorful Accent 1" w:uiPriority="52"/>
+    <w:lsdException w:name="Grid Table 1 Light Accent 2" w:uiPriority="46"/>
+    <w:lsdException w:name="Grid Table 2 Accent 2" w:uiPriority="47"/>
+    <w:lsdException w:name="Grid Table 3 Accent 2" w:uiPriority="48"/>
+    <w:lsdException w:name="Grid Table 4 Accent 2" w:uiPriority="49"/>
+    <w:lsdException w:name="Grid Table 5 Dark Accent 2" w:uiPriority="50"/>
+    <w:lsdException w:name="Grid Table 6 Colorful Accent 2" w:uiPriority="51"/>
+    <w:lsdException w:name="Grid Table 7 Colorful Accent 2" w:uiPriority="52"/>
+    <w:lsdException w:name="Grid Table 1 Light Accent 3" w:uiPriority="46"/>
+    <w:lsdException w:name="Grid Table 2 Accent 3" w:uiPriority="47"/>
+    <w:lsdException w:name="Grid Table 3 Accent 3" w:uiPriority="48"/>
+    <w:lsdException w:name="Grid Table 4 Accent 3" w:uiPriority="49"/>
+    <w:lsdException w:name="Grid Table 5 Dark Accent 3" w:uiPriority="50"/>
+    <w:lsdException w:name="Grid Table 6 Colorful Accent 3" w:uiPriority="51"/>
+    <w:lsdException w:name="Grid Table 7 Colorful Accent 3" w:uiPriority="52"/>
+    <w:lsdException w:name="Grid Table 1 Light Accent 4" w:uiPriority="46"/>
+    <w:lsdException w:name="Grid Table 2 Accent 4" w:uiPriority="47"/>
+    <w:lsdException w:name="Grid Table 3 Accent 4" w:uiPriority="48"/>
+    <w:lsdException w:name="Grid Table 4 Accent 4" w:uiPriority="49"/>
+    <w:lsdException w:name="Grid Table 5 Dark Accent 4" w:uiPriority="50"/>
+    <w:lsdException w:name="Grid Table 6 Colorful Accent 4" w:uiPriority="51"/>
+    <w:lsdException w:name="Grid Table 7 Colorful Accent 4" w:uiPriority="52"/>
+    <w:lsdException w:name="Grid Table 1 Light Accent 5" w:uiPriority="46"/>
+    <w:lsdException w:name="Grid Table 2 Accent 5" w:uiPriority="47"/>
+    <w:lsdException w:name="Grid Table 3 Accent 5" w:uiPriority="48"/>
+    <w:lsdException w:name="Grid Table 4 Accent 5" w:uiPriority="49"/>
+    <w:lsdException w:name="Grid Table 5 Dark Accent 5" w:uiPriority="50"/>
+    <w:lsdException w:name="Grid Table 6 Colorful Accent 5" w:uiPriority="51"/>
+    <w:lsdException w:name="Grid Table 7 Colorful Accent 5" w:uiPriority="52"/>
+    <w:lsdException w:name="Grid Table 1 Light Accent 6" w:uiPriority="46"/>
+    <w:lsdException w:name="Grid Table 2 Accent 6" w:uiPriority="47"/>
+    <w:lsdException w:name="Grid Table 3 Accent 6" w:uiPriority="48"/>
+    <w:lsdException w:name="Grid Table 4 Accent 6" w:uiPriority="49"/>
+    <w:lsdException w:name="Grid Table 5 Dark Accent 6" w:uiPriority="50"/>
+    <w:lsdException w:name="Grid Table 6 Colorful Accent 6" w:uiPriority="51"/>
+    <w:lsdException w:name="Grid Table 7 Colorful Accent 6" w:uiPriority="52"/>
+    <w:lsdException w:name="List Table 1 Light" w:uiPriority="46"/>
+    <w:lsdException w:name="List Table 2" w:uiPriority="47"/>
+    <w:lsdException w:name="List Table 3" w:uiPriority="48"/>
+    <w:lsdException w:name="List Table 4" w:uiPriority="49"/>
+    <w:lsdException w:name="List Table 5 Dark" w:uiPriority="50"/>
+    <w:lsdException w:name="List Table 6 Colorful" w:uiPriority="51"/>
+    <w:lsdException w:name="List Table 7 Colorful" w:uiPriority="52"/>
+    <w:lsdException w:name="List Table 1 Light Accent 1" w:uiPriority="46"/>
+    <w:lsdException w:name="List Table 2 Accent 1" w:uiPriority="47"/>
+    <w:lsdException w:name="List Table 3 Accent 1" w:uiPriority="48"/>
+    <w:lsdException w:name="List Table 4 Accent 1" w:uiPriority="49"/>
+    <w:lsdException w:name="List Table 5 Dark Accent 1" w:uiPriority="50"/>
+    <w:lsdException w:name="List Table 6 Colorful Accent 1" w:uiPriority="51"/>
+    <w:lsdException w:name="List Table 7 Colorful Accent 1" w:uiPriority="52"/>
+    <w:lsdException w:name="List Table 1 Light Accent 2" w:uiPriority="46"/>
+    <w:lsdException w:name="List Table 2 Accent 2" w:uiPriority="47"/>
+    <w:lsdException w:name="List Table 3 Accent 2" w:uiPriority="48"/>
+    <w:lsdException w:name="List Table 4 Accent 2" w:uiPriority="49"/>
+    <w:lsdException w:name="List Table 5 Dark Accent 2" w:uiPriority="50"/>
+    <w:lsdException w:name="List Table 6 Colorful Accent 2" w:uiPriority="51"/>
+    <w:lsdException w:name="List Table 7 Colorful Accent 2" w:uiPriority="52"/>
+    <w:lsdException w:name="List Table 1 Light Accent 3" w:uiPriority="46"/>
+    <w:lsdException w:name="List Table 2 Accent 3" w:uiPriority="47"/>
+    <w:lsdException w:name="List Table 3 Accent 3" w:uiPriority="48"/>
+    <w:lsdException w:name="List Table 4 Accent 3" w:uiPriority="49"/>
+    <w:lsdException w:name="List Table 5 Dark Accent 3" w:uiPriority="50"/>
+    <w:lsdException w:name="List Table 6 Colorful Accent 3" w:uiPriority="51"/>
+    <w:lsdException w:name="List Table 7 Colorful Accent 3" w:uiPriority="52"/>
+    <w:lsdException w:name="List Table 1 Light Accent 4" w:uiPriority="46"/>
+    <w:lsdException w:name="List Table 2 Accent 4" w:uiPriority="47"/>
+    <w:lsdException w:name="List Table 3 Accent 4" w:uiPriority="48"/>
+    <w:lsdException w:name="List Table 4 Accent 4" w:uiPriority="49"/>
+    <w:lsdException w:name="List Table 5 Dark Accent 4" w:uiPriority="50"/>
+    <w:lsdException w:name="List Table 6 Colorful Accent 4" w:uiPriority="51"/>
+    <w:lsdException w:name="List Table 7 Colorful Accent 4" w:uiPriority="52"/>
+    <w:lsdException w:name="List Table 1 Light Accent 5" w:uiPriority="46"/>
+    <w:lsdException w:name="List Table 2 Accent 5" w:uiPriority="47"/>
+    <w:lsdException w:name="List Table 3 Accent 5" w:uiPriority="48"/>
+    <w:lsdException w:name="List Table 4 Accent 5" w:uiPriority="49"/>
+    <w:lsdException w:name="List Table 5 Dark Accent 5" w:uiPriority="50"/>
+    <w:lsdException w:name="List Table 6 Colorful Accent 5" w:uiPriority="51"/>
+    <w:lsdException w:name="List Table 7 Colorful Accent 5" w:uiPriority="52"/>
+    <w:lsdException w:name="List Table 1 Light Accent 6" w:uiPriority="46"/>
+    <w:lsdException w:name="List Table 2 Accent 6" w:uiPriority="47"/>
+    <w:lsdException w:name="List Table 3 Accent 6" w:uiPriority="48"/>
+    <w:lsdException w:name="List Table 4 Accent 6" w:uiPriority="49"/>
+    <w:lsdException w:name="List Table 5 Dark Accent 6" w:uiPriority="50"/>
+    <w:lsdException w:name="List Table 6 Colorful Accent 6" w:uiPriority="51"/>
+    <w:lsdException w:name="List Table 7 Colorful Accent 6" w:uiPriority="52"/>
+    <w:lsdException w:name="Mention" w:semiHidden="1" w:uiPriority="99" w:unhideWhenUsed="1"/>
+    <w:lsdException w:name="Smart Hyperlink" w:semiHidden="1" w:uiPriority="99" w:unhideWhenUsed="1"/>
+    <w:lsdException w:name="Hashtag" w:semiHidden="1" w:uiPriority="99" w:unhideWhenUsed="1"/>
+    <w:lsdException w:name="Unresolved Mention" w:semiHidden="1" w:uiPriority="99" w:unhideWhenUsed="1"/>
+    <w:lsdException w:name="Smart Link" w:semiHidden="1" w:uiPriority="99" w:unhideWhenUsed="1"/>
   </w:latentStyles>
-  <w:style w:type="paragraph" w:default="1" w:styleId="1">
+  <w:style w:type="paragraph" w:default="1" w:styleId="Normal">
     <w:name w:val="Normal"/>
     <w:qFormat/>
-    <w:uiPriority w:val="0"/>
     <w:rPr>
-      <w:rFonts w:asciiTheme="minorHAnsi" w:hAnsiTheme="minorHAnsi" w:eastAsiaTheme="minorEastAsia" w:cstheme="minorBidi"/>
-      <w:lang w:val="en-US" w:eastAsia="zh-CN" w:bidi="ar-SA"/>
+      <w:rFonts w:asciiTheme="minorHAnsi" w:eastAsiaTheme="minorEastAsia" w:hAnsiTheme="minorHAnsi" w:cstheme="minorBidi"/>
+      <w:lang w:val="en-US" w:eastAsia="zh-CN"/>
     </w:rPr>
   </w:style>
-  <w:style w:type="character" w:default="1" w:styleId="2">
+  <w:style w:type="character" w:default="1" w:styleId="Fontepargpadro">
     <w:name w:val="Default Paragraph Font"/>
+    <w:uiPriority w:val="1"/>
     <w:semiHidden/>
     <w:unhideWhenUsed/>
-    <w:qFormat/>
-    <w:uiPriority w:val="1"/>
   </w:style>
-  <w:style w:type="table" w:default="1" w:styleId="3">
+  <w:style w:type="table" w:default="1" w:styleId="Tabelanormal">
     <w:name w:val="Normal Table"/>
+    <w:uiPriority w:val="99"/>
     <w:semiHidden/>
     <w:unhideWhenUsed/>
-    <w:qFormat/>
-    <w:uiPriority w:val="99"/>
     <w:tblPr>
+      <w:tblInd w:w="0" w:type="dxa"/>
       <w:tblCellMar>
         <w:top w:w="0" w:type="dxa"/>
         <w:left w:w="108" w:type="dxa"/>
@@ -3325,6 +3563,12 @@
         <w:right w:w="108" w:type="dxa"/>
       </w:tblCellMar>
     </w:tblPr>
+  </w:style>
+  <w:style w:type="numbering" w:default="1" w:styleId="Semlista">
+    <w:name w:val="No List"/>
+    <w:uiPriority w:val="99"/>
+    <w:semiHidden/>
+    <w:unhideWhenUsed/>
   </w:style>
 </w:styles>
 </file>
@@ -3581,5 +3825,6 @@
     </a:fmtScheme>
   </a:themeElements>
   <a:objectDefaults/>
+  <a:extraClrSchemeLst/>
 </a:theme>
 </file>
</xml_diff>